<commit_message>
docs: interview prep docx aligned with multi-tenant reality - 140+ Q&A incl. tenancy block (Q133-Q140), register rules, tenant-scoped claims, 34 tests / 62 checks / 25 commits / 28 endpoints / fresh bundle sizes
</commit_message>
<xml_diff>
--- a/MunimJi_Interview_Prep.docx
+++ b/MunimJi_Interview_Prep.docx
@@ -96,7 +96,7 @@
           <w:sz w:val="22"/>
           <w:szCs w:val="22"/>
         </w:rPr>
-        <w:t>13 sections  ·  130+ Q&amp;A  ·  every claim grounded in this repository</w:t>
+        <w:t>13 sections  ·  140+ Q&amp;A  ·  every claim grounded in this repository</w:t>
       </w:r>
     </w:p>
     <w:p>
@@ -2587,7 +2587,7 @@
                 <w:rStyle w:val="Hyperlink"/>
                 <w:noProof/>
               </w:rPr>
-              <w:t>Development order (matches the 12 git commits)</w:t>
+              <w:t>Development order (matches the 25 git commits)</w:t>
             </w:r>
             <w:r>
               <w:rPr>
@@ -3123,7 +3123,7 @@
                 <w:rStyle w:val="Hyperlink"/>
                 <w:noProof/>
               </w:rPr>
-              <w:t>Automated tests: 25 in 8 classes (brief asked 15)</w:t>
+              <w:t>Automated tests: 34 in 9 classes (brief asked 15)</w:t>
             </w:r>
             <w:r>
               <w:rPr>
@@ -4865,7 +4865,7 @@
                 <w:rStyle w:val="Hyperlink"/>
                 <w:noProof/>
               </w:rPr>
-              <w:t>Top 15 questions to rehearse</w:t>
+              <w:t>Top 16 questions to rehearse</w:t>
             </w:r>
             <w:r>
               <w:rPr>
@@ -5175,7 +5175,7 @@
           <w:b/>
           <w:bCs/>
         </w:rPr>
-        <w:t>H2/MySQL</w:t>
+        <w:t>H2/MySQL, multi-tenant shop isolation</w:t>
       </w:r>
       <w:r>
         <w:t xml:space="preserve">, </w:t>
@@ -5185,7 +5185,7 @@
           <w:b/>
           <w:bCs/>
         </w:rPr>
-        <w:t>25 automated tests</w:t>
+        <w:t>34 automated tests</w:t>
       </w:r>
       <w:r>
         <w:t xml:space="preserve"> and a </w:t>
@@ -5195,7 +5195,7 @@
           <w:b/>
           <w:bCs/>
         </w:rPr>
-        <w:t>59-check end-to-end smoke test</w:t>
+        <w:t>62-check end-to-end smoke test</w:t>
       </w:r>
       <w:r>
         <w:t>.</w:t>
@@ -5556,7 +5556,7 @@
           <w:sz w:val="18"/>
           <w:szCs w:val="18"/>
         </w:rPr>
-        <w:t xml:space="preserve"> For quality I wrote 25 JUnit and MockMvc tests, plus a 59-check</w:t>
+        <w:t xml:space="preserve"> For quality I wrote 34 JUnit and MockMvc tests, plus a 62-check</w:t>
       </w:r>
     </w:p>
     <w:p>
@@ -6036,7 +6036,7 @@
         <w:t>Auth</w:t>
       </w:r>
       <w:r>
-        <w:t>: JWT login, OWNER vs STAFF roles, first-user bootstrap registration.</w:t>
+        <w:t>: JWT login, OWNER vs STAFF roles, public shop registration (anonymous sign-up creates an OWNER; an OWNER adds STAFF).</w:t>
       </w:r>
     </w:p>
     <w:p>
@@ -6056,7 +6056,7 @@
         <w:t>Docs</w:t>
       </w:r>
       <w:r>
-        <w:t>: README, decisions log, 25 tests, 59-check smoke test script.</w:t>
+        <w:t>: README, decisions log, 34 tests, 62-check smoke test script.</w:t>
       </w:r>
     </w:p>
     <w:p>
@@ -6971,7 +6971,7 @@
           <w:sz w:val="18"/>
           <w:szCs w:val="18"/>
         </w:rPr>
-        <w:t>controller/    9 controllers: Auth, Category, Product, Supplier,</w:t>
+        <w:t>controller/    8 controllers: Auth, Category, Product, Supplier,</w:t>
       </w:r>
     </w:p>
     <w:p>
@@ -6986,7 +6986,7 @@
           <w:sz w:val="18"/>
           <w:szCs w:val="18"/>
         </w:rPr>
-        <w:t xml:space="preserve">               Purchase, Stock, Invoice, Report + Pdf endpoint</w:t>
+        <w:t xml:space="preserve">               Purchase, Stock, Invoice, Report (PDF endpoint in InvoiceController)</w:t>
       </w:r>
     </w:p>
     <w:p>
@@ -7106,7 +7106,7 @@
           <w:sz w:val="18"/>
           <w:szCs w:val="18"/>
         </w:rPr>
-        <w:t>security/      JwtUtil, JwtAuthFilter, UserDetailsServiceImpl</w:t>
+        <w:t>security/      JwtUtil, JwtAuthFilter, UserDetailsServiceImpl, AppUserDetails, CurrentTenant</w:t>
       </w:r>
     </w:p>
     <w:p>
@@ -7196,7 +7196,7 @@
           <w:sz w:val="18"/>
           <w:szCs w:val="18"/>
         </w:rPr>
-        <w:t xml:space="preserve">               pages/       (Login, Dashboard, Billing, Products, ...)</w:t>
+        <w:t xml:space="preserve">               pages/       (Login, Register, Dashboard, Billing, Products, ... Users)</w:t>
       </w:r>
     </w:p>
     <w:p>
@@ -7339,6 +7339,50 @@
       </w:r>
       <w:r>
         <w:t>.</w:t>
+      </w:r>
+    </w:p>
+    <w:p>
+      <w:pPr>
+        <w:pStyle w:val="ListParagraph"/>
+        <w:numPr>
+          <w:ilvl w:val="0"/>
+          <w:numId w:val="2"/>
+        </w:numPr>
+        <w:spacing w:after="50" w:line="264" w:lineRule="auto"/>
+      </w:pPr>
+      <w:r>
+        <w:rPr>
+          <w:b/>
+          <w:bCs/>
+        </w:rPr>
+        <w:t xml:space="preserve">Query scoping</w:t>
+      </w:r>
+      <w:r>
+        <w:t xml:space="preserve"> - every repository method takes the tenant id (</w:t>
+      </w:r>
+      <w:r>
+        <w:rPr>
+          <w:rFonts w:ascii="Consolas" w:eastAsia="Consolas" w:hAnsi="Consolas" w:cs="Consolas"/>
+          <w:color w:val="B03A2E"/>
+          <w:sz w:val="20"/>
+          <w:szCs w:val="20"/>
+        </w:rPr>
+        <w:t xml:space="preserve">search(ownerId, ...)</w:t>
+      </w:r>
+      <w:r>
+        <w:t xml:space="preserve">, </w:t>
+      </w:r>
+      <w:r>
+        <w:rPr>
+          <w:rFonts w:ascii="Consolas" w:eastAsia="Consolas" w:hAnsi="Consolas" w:cs="Consolas"/>
+          <w:color w:val="B03A2E"/>
+          <w:sz w:val="20"/>
+          <w:szCs w:val="20"/>
+        </w:rPr>
+        <w:t xml:space="preserve">findTopByOwnerIdOrderByIdDesc</w:t>
+      </w:r>
+      <w:r>
+        <w:t xml:space="preserve">); isolation lives in the query signatures, not in call-site discipline.</w:t>
       </w:r>
     </w:p>
     <w:p>
@@ -8825,7 +8869,7 @@
           <w:sz w:val="20"/>
           <w:szCs w:val="20"/>
         </w:rPr>
-        <w:t>App.jsx</w:t>
+        <w:t xml:space="preserve">App.jsx</w:t>
       </w:r>
       <w:r>
         <w:t xml:space="preserve"> routes: </w:t>
@@ -8837,7 +8881,19 @@
           <w:sz w:val="20"/>
           <w:szCs w:val="20"/>
         </w:rPr>
-        <w:t>/login</w:t>
+        <w:t xml:space="preserve">/login</w:t>
+      </w:r>
+      <w:r>
+        <w:t xml:space="preserve"> and </w:t>
+      </w:r>
+      <w:r>
+        <w:rPr>
+          <w:rFonts w:ascii="Consolas" w:eastAsia="Consolas" w:hAnsi="Consolas" w:cs="Consolas"/>
+          <w:color w:val="B03A2E"/>
+          <w:sz w:val="20"/>
+          <w:szCs w:val="20"/>
+        </w:rPr>
+        <w:t xml:space="preserve">/register</w:t>
       </w:r>
       <w:r>
         <w:t xml:space="preserve"> public; everything else wraps </w:t>
@@ -8849,7 +8905,7 @@
           <w:sz w:val="20"/>
           <w:szCs w:val="20"/>
         </w:rPr>
-        <w:t>&lt;ProtectedRoute&gt;</w:t>
+        <w:t xml:space="preserve">ProtectedRoute</w:t>
       </w:r>
       <w:r>
         <w:t xml:space="preserve"> -&gt; </w:t>
@@ -8861,7 +8917,7 @@
           <w:sz w:val="20"/>
           <w:szCs w:val="20"/>
         </w:rPr>
-        <w:t>&lt;Layout&gt;</w:t>
+        <w:t xml:space="preserve">Layout</w:t>
       </w:r>
       <w:r>
         <w:t xml:space="preserve"> (sidebar + navbar + page outlet).</w:t>
@@ -9070,7 +9126,7 @@
           <w:b/>
           <w:bCs/>
         </w:rPr>
-        <w:t>users</w:t>
+        <w:t xml:space="preserve">users</w:t>
       </w:r>
       <w:r>
         <w:t xml:space="preserve"> - id, name, email (UNIQUE), password (BCrypt), role (OWNER/STAFF, </w:t>
@@ -9082,10 +9138,10 @@
           <w:sz w:val="20"/>
           <w:szCs w:val="20"/>
         </w:rPr>
-        <w:t>@Enumerated(STRING)</w:t>
-      </w:r>
-      <w:r>
-        <w:t>).</w:t>
+        <w:t xml:space="preserve">@Enumerated(STRING)</w:t>
+      </w:r>
+      <w:r>
+        <w:t xml:space="preserve">), owner_id (null for OWNER, the owner's user id for STAFF).</w:t>
       </w:r>
     </w:p>
     <w:p>
@@ -9105,7 +9161,7 @@
         <w:t>category</w:t>
       </w:r>
       <w:r>
-        <w:t xml:space="preserve"> - id, name (UNIQUE).</w:t>
+        <w:t xml:space="preserve"> - id, name, owner_id (name unique per shop, checked in the service).</w:t>
       </w:r>
     </w:p>
     <w:p>
@@ -9125,7 +9181,7 @@
         <w:t>product</w:t>
       </w:r>
       <w:r>
-        <w:t xml:space="preserve"> - id, name, barcode, unit, hsn_code, gst_rate (5,2), selling_price (19,2), reorder_level, category_id FK (LAZY).</w:t>
+        <w:t xml:space="preserve"> - id, name, barcode, unit, hsn_code, gst_rate (5,2), selling_price (19,2), reorder_level, category_id FK (LAZY), owner_id.</w:t>
       </w:r>
     </w:p>
     <w:p>
@@ -9145,7 +9201,7 @@
         <w:t>supplier</w:t>
       </w:r>
       <w:r>
-        <w:t xml:space="preserve"> - id, name, phone, email, address, gstin.</w:t>
+        <w:t xml:space="preserve"> - id, name, phone, email, address, gstin, owner_id.</w:t>
       </w:r>
     </w:p>
     <w:p>
@@ -9165,7 +9221,7 @@
         <w:t>purchase</w:t>
       </w:r>
       <w:r>
-        <w:t xml:space="preserve"> - id, supplier_bill_no, supplier_id FK, purchase_date, total (19,2).</w:t>
+        <w:t xml:space="preserve"> - id, supplier_bill_no, supplier_id FK, purchase_date, total (19,2), owner_id.</w:t>
       </w:r>
     </w:p>
     <w:p>
@@ -9247,7 +9303,7 @@
         <w:t>invoice</w:t>
       </w:r>
       <w:r>
-        <w:t xml:space="preserve"> - id, invoice_number (UNIQUE), invoice_date, customer_name, customer_phone, sub_total, discount_amount, cgst_amount, sgst_amount, gst_amount, grand_total - all (19,2).</w:t>
+        <w:t xml:space="preserve"> - id, invoice_number (unique per shop), invoice_date, customer_name, customer_phone, sub_total, discount_amount, cgst_amount, sgst_amount, gst_amount, grand_total, owner_id - money columns (19,2).</w:t>
       </w:r>
     </w:p>
     <w:p>
@@ -9470,31 +9526,7 @@
           <w:sz w:val="20"/>
           <w:szCs w:val="20"/>
         </w:rPr>
-        <w:t>users.email</w:t>
-      </w:r>
-      <w:r>
-        <w:t xml:space="preserve">, </w:t>
-      </w:r>
-      <w:r>
-        <w:rPr>
-          <w:rFonts w:ascii="Consolas" w:eastAsia="Consolas" w:hAnsi="Consolas" w:cs="Consolas"/>
-          <w:color w:val="B03A2E"/>
-          <w:sz w:val="20"/>
-          <w:szCs w:val="20"/>
-        </w:rPr>
-        <w:t>category.name</w:t>
-      </w:r>
-      <w:r>
-        <w:t xml:space="preserve">, </w:t>
-      </w:r>
-      <w:r>
-        <w:rPr>
-          <w:rFonts w:ascii="Consolas" w:eastAsia="Consolas" w:hAnsi="Consolas" w:cs="Consolas"/>
-          <w:color w:val="B03A2E"/>
-          <w:sz w:val="20"/>
-          <w:szCs w:val="20"/>
-        </w:rPr>
-        <w:t>invoice.invoice_number</w:t>
+        <w:t xml:space="preserve">users.email</w:t>
       </w:r>
       <w:r>
         <w:t xml:space="preserve"> via </w:t>
@@ -9506,34 +9538,22 @@
           <w:sz w:val="20"/>
           <w:szCs w:val="20"/>
         </w:rPr>
-        <w:t>@Column(unique = true)</w:t>
-      </w:r>
-      <w:r>
-        <w:t xml:space="preserve">; barcode uniqueness enforced in </w:t>
-      </w:r>
-      <w:r>
-        <w:rPr>
-          <w:rFonts w:ascii="Consolas" w:eastAsia="Consolas" w:hAnsi="Consolas" w:cs="Consolas"/>
-          <w:color w:val="B03A2E"/>
-          <w:sz w:val="20"/>
-          <w:szCs w:val="20"/>
-        </w:rPr>
-        <w:t>ProductService</w:t>
-      </w:r>
-      <w:r>
-        <w:t xml:space="preserve"> (</w:t>
-      </w:r>
-      <w:r>
-        <w:rPr>
-          <w:rFonts w:ascii="Consolas" w:eastAsia="Consolas" w:hAnsi="Consolas" w:cs="Consolas"/>
-          <w:color w:val="B03A2E"/>
-          <w:sz w:val="20"/>
-          <w:szCs w:val="20"/>
-        </w:rPr>
-        <w:t>existsByBarcode</w:t>
-      </w:r>
-      <w:r>
-        <w:t xml:space="preserve"> -&gt; 409).</w:t>
+        <w:t xml:space="preserve">@Column(unique = true)</w:t>
+      </w:r>
+      <w:r>
+        <w:t xml:space="preserve"> - DB level. The shop-scoped ones are per-tenant: </w:t>
+      </w:r>
+      <w:r>
+        <w:rPr>
+          <w:rFonts w:ascii="Consolas" w:eastAsia="Consolas" w:hAnsi="Consolas" w:cs="Consolas"/>
+          <w:color w:val="B03A2E"/>
+          <w:sz w:val="20"/>
+          <w:szCs w:val="20"/>
+        </w:rPr>
+        <w:t xml:space="preserve">category.name</w:t>
+      </w:r>
+      <w:r>
+        <w:t xml:space="preserve">, barcode and invoice numbers are checked only inside the caller's own rows (duplicates return 409).</w:t>
       </w:r>
     </w:p>
     <w:p>
@@ -9599,7 +9619,7 @@
           <w:b/>
           <w:bCs/>
         </w:rPr>
-        <w:t>No hand-written index DDL in the repo</w:t>
+        <w:t xml:space="preserve">No hand-written index DDL in the repo</w:t>
       </w:r>
       <w:r>
         <w:t xml:space="preserve"> - schema comes from Hibernate (</w:t>
@@ -9611,7 +9631,7 @@
           <w:sz w:val="20"/>
           <w:szCs w:val="20"/>
         </w:rPr>
-        <w:t>ddl-auto=update</w:t>
+        <w:t xml:space="preserve">ddl-auto=update</w:t>
       </w:r>
       <w:r>
         <w:t xml:space="preserve">). Honest answer: for production MySQL I would add indexes on </w:t>
@@ -9623,7 +9643,7 @@
           <w:sz w:val="20"/>
           <w:szCs w:val="20"/>
         </w:rPr>
-        <w:t>stock_batch(product_id, expiry_date)</w:t>
+        <w:t xml:space="preserve">stock_batch(product_id, expiry_date)</w:t>
       </w:r>
       <w:r>
         <w:t xml:space="preserve">, </w:t>
@@ -9635,10 +9655,10 @@
           <w:sz w:val="20"/>
           <w:szCs w:val="20"/>
         </w:rPr>
-        <w:t>invoice(invoice_date)</w:t>
-      </w:r>
-      <w:r>
-        <w:t xml:space="preserve"> and FK columns.</w:t>
+        <w:t xml:space="preserve">invoice(invoice_date)</w:t>
+      </w:r>
+      <w:r>
+        <w:t xml:space="preserve">, (owner_id, ...) composites for tenant scans and FK columns.</w:t>
       </w:r>
     </w:p>
     <w:p>
@@ -10710,7 +10730,7 @@
           <w:sz w:val="18"/>
           <w:szCs w:val="18"/>
         </w:rPr>
-        <w:t>// InvoiceService.nextInvoiceNumber()</w:t>
+        <w:t>// InvoiceService.nextInvoiceNumber(ownerId)</w:t>
       </w:r>
     </w:p>
     <w:p>
@@ -10725,7 +10745,7 @@
           <w:sz w:val="18"/>
           <w:szCs w:val="18"/>
         </w:rPr>
-        <w:t>Optional&lt;Invoice&gt; last = invoiceRepository.findTopByOrderByIdDesc();</w:t>
+        <w:t>Optional&lt;Invoice&gt; last = invoiceRepository.findTopByOwnerIdOrderByIdDesc(ownerId);</w:t>
       </w:r>
     </w:p>
     <w:p>
@@ -10805,7 +10825,7 @@
         <w:t>restarts each calendar year</w:t>
       </w:r>
       <w:r>
-        <w:t>, continues from the shop's last invoice of this year.</w:t>
+        <w:t>, continues from that shop's last invoice of this year.</w:t>
       </w:r>
     </w:p>
     <w:p>
@@ -10818,14 +10838,26 @@
         <w:spacing w:after="50" w:line="264" w:lineRule="auto"/>
       </w:pPr>
       <w:r>
-        <w:t xml:space="preserve">Simple read-and-increment: perfect for one shop; </w:t>
-      </w:r>
-      <w:r>
-        <w:rPr>
-          <w:b/>
-          <w:bCs/>
-        </w:rPr>
-        <w:t>not gap-free under concurrency</w:t>
+        <w:t xml:space="preserve">Simple read-and-increment, scoped to the tenant (</w:t>
+      </w:r>
+      <w:r>
+        <w:rPr>
+          <w:rFonts w:ascii="Consolas" w:eastAsia="Consolas" w:hAnsi="Consolas" w:cs="Consolas"/>
+          <w:color w:val="B03A2E"/>
+          <w:sz w:val="20"/>
+          <w:szCs w:val="20"/>
+        </w:rPr>
+        <w:t xml:space="preserve">findTopByOwnerIdOrderByIdDesc</w:t>
+      </w:r>
+      <w:r>
+        <w:t xml:space="preserve">): perfect per shop; </w:t>
+      </w:r>
+      <w:r>
+        <w:rPr>
+          <w:b/>
+          <w:bCs/>
+        </w:rPr>
+        <w:t xml:space="preserve">not gap-free under concurrency</w:t>
       </w:r>
       <w:r>
         <w:t xml:space="preserve"> (I will say this before the interviewer does - see limitations).</w:t>
@@ -11288,38 +11320,19 @@
         <w:spacing w:after="50" w:line="264" w:lineRule="auto"/>
       </w:pPr>
       <w:r>
-        <w:rPr>
-          <w:b/>
-          <w:bCs/>
-        </w:rPr>
-        <w:t>`AuthService.register()`</w:t>
-      </w:r>
-      <w:r>
-        <w:t xml:space="preserve"> - bootstrap rule: </w:t>
-      </w:r>
-      <w:r>
-        <w:rPr>
-          <w:rFonts w:ascii="Consolas" w:eastAsia="Consolas" w:hAnsi="Consolas" w:cs="Consolas"/>
-          <w:color w:val="B03A2E"/>
-          <w:sz w:val="20"/>
-          <w:szCs w:val="20"/>
-        </w:rPr>
-        <w:t>if (userRepository.count() == 0)</w:t>
-      </w:r>
-      <w:r>
-        <w:t xml:space="preserve"> anyone may register (first user becomes owner), else only OWNER (</w:t>
-      </w:r>
-      <w:r>
-        <w:rPr>
-          <w:rFonts w:ascii="Consolas" w:eastAsia="Consolas" w:hAnsi="Consolas" w:cs="Consolas"/>
-          <w:color w:val="B03A2E"/>
-          <w:sz w:val="20"/>
-          <w:szCs w:val="20"/>
-        </w:rPr>
-        <w:t>ForbiddenException</w:t>
-      </w:r>
-      <w:r>
-        <w:t>). Email stored lowercase; password BCrypt-hashed.</w:t>
+        <w:t xml:space="preserve">`</w:t>
+      </w:r>
+      <w:r>
+        <w:rPr>
+          <w:rFonts w:ascii="Consolas" w:eastAsia="Consolas" w:hAnsi="Consolas" w:cs="Consolas"/>
+          <w:color w:val="B03A2E"/>
+          <w:sz w:val="20"/>
+          <w:szCs w:val="20"/>
+        </w:rPr>
+        <w:t xml:space="preserve">AuthService.register()</w:t>
+      </w:r>
+      <w:r>
+        <w:t xml:space="preserve">` - three modes: anonymous callers may register only as OWNER (that starts a new shop - the old first-user bootstrap rule is gone); an OWNER token may only add STAFF, with owner_id set to the caller's shop; a STAFF token always gets 403. Email stored lowercase; password BCrypt-hashed.</w:t>
       </w:r>
     </w:p>
     <w:p>
@@ -11913,7 +11926,7 @@
       </w:pPr>
       <w:bookmarkStart w:id="35" w:name="_Toc242064850"/>
       <w:r>
-        <w:t>Development order (matches the 12 git commits)</w:t>
+        <w:t>Development order (matches the 25 git commits)</w:t>
       </w:r>
       <w:bookmarkEnd w:id="35"/>
     </w:p>
@@ -12151,28 +12164,15 @@
         <w:spacing w:after="50" w:line="264" w:lineRule="auto"/>
       </w:pPr>
       <w:r>
-        <w:t xml:space="preserve">Approach: </w:t>
-      </w:r>
-      <w:r>
-        <w:rPr>
-          <w:b/>
-          <w:bCs/>
-        </w:rPr>
-        <w:t>walking skeleton first</w:t>
-      </w:r>
-      <w:r>
-        <w:t xml:space="preserve"> - one thin slice through every layer (auth), then feature-by-feature depth (billing core after basic CRUD).</w:t>
-      </w:r>
-    </w:p>
-    <w:p>
-      <w:pPr>
-        <w:pStyle w:val="Heading2"/>
-      </w:pPr>
-      <w:bookmarkStart w:id="36" w:name="_Toc242064851"/>
-      <w:r>
-        <w:t>Challenges faced and how I solved them (from real code/commits)</w:t>
-      </w:r>
-      <w:bookmarkEnd w:id="36"/>
+        <w:rPr>
+          <w:b/>
+          <w:bCs/>
+        </w:rPr>
+        <w:t xml:space="preserve">Commit 12</w:t>
+      </w:r>
+      <w:r>
+        <w:t xml:space="preserve"> - splash loader video and MunimJi logo branding (transparent wordmark, favicon).</w:t>
+      </w:r>
     </w:p>
     <w:p>
       <w:pPr>
@@ -12188,20 +12188,10 @@
           <w:b/>
           <w:bCs/>
         </w:rPr>
-        <w:t>Rounding drift in GST</w:t>
-      </w:r>
-      <w:r>
-        <w:t xml:space="preserve"> - naive per-line splits could lose 0.01. Solved: divide at scale 8 then round, and give the </w:t>
-      </w:r>
-      <w:r>
-        <w:rPr>
-          <w:b/>
-          <w:bCs/>
-        </w:rPr>
-        <w:t>remainder to the last line</w:t>
-      </w:r>
-      <w:r>
-        <w:t xml:space="preserve"> so parts sum exactly.</w:t>
+        <w:t xml:space="preserve">Commits 13-15</w:t>
+      </w:r>
+      <w:r>
+        <w:t xml:space="preserve"> - diagram set in UnderstsndThisProject (runtime architecture, HLD/LLD, flows), repo cleanup, interview prep document.</w:t>
       </w:r>
     </w:p>
     <w:p>
@@ -12218,34 +12208,10 @@
           <w:b/>
           <w:bCs/>
         </w:rPr>
-        <w:t>Two batches per product</w:t>
-      </w:r>
-      <w:r>
-        <w:t xml:space="preserve"> - a single </w:t>
-      </w:r>
-      <w:r>
-        <w:rPr>
-          <w:rFonts w:ascii="Consolas" w:eastAsia="Consolas" w:hAnsi="Consolas" w:cs="Consolas"/>
-          <w:color w:val="B03A2E"/>
-          <w:sz w:val="20"/>
-          <w:szCs w:val="20"/>
-        </w:rPr>
-        <w:t>quantity</w:t>
-      </w:r>
-      <w:r>
-        <w:t xml:space="preserve"> column could not express FEFO. Solved: </w:t>
-      </w:r>
-      <w:r>
-        <w:rPr>
-          <w:rFonts w:ascii="Consolas" w:eastAsia="Consolas" w:hAnsi="Consolas" w:cs="Consolas"/>
-          <w:color w:val="B03A2E"/>
-          <w:sz w:val="20"/>
-          <w:szCs w:val="20"/>
-        </w:rPr>
-        <w:t>stock_batch</w:t>
-      </w:r>
-      <w:r>
-        <w:t xml:space="preserve"> table + JPQL ordered by expiry; smoke test drains B1 before B2.</w:t>
+        <w:t xml:space="preserve">Commits 16-19</w:t>
+      </w:r>
+      <w:r>
+        <w:t xml:space="preserve"> - offline demo mode: mock dataset when the backend is unreachable, dummy owner login, brand tile polish, diagram prune.</w:t>
       </w:r>
     </w:p>
     <w:p>
@@ -12262,22 +12228,10 @@
           <w:b/>
           <w:bCs/>
         </w:rPr>
-        <w:t>Rollback proof</w:t>
-      </w:r>
-      <w:r>
-        <w:t xml:space="preserve"> - if stock deducts but the invoice fails, the shop loses stock. Solved: everything inside one </w:t>
-      </w:r>
-      <w:r>
-        <w:rPr>
-          <w:rFonts w:ascii="Consolas" w:eastAsia="Consolas" w:hAnsi="Consolas" w:cs="Consolas"/>
-          <w:color w:val="B03A2E"/>
-          <w:sz w:val="20"/>
-          <w:szCs w:val="20"/>
-        </w:rPr>
-        <w:t>@Transactional</w:t>
-      </w:r>
-      <w:r>
-        <w:t xml:space="preserve"> method; smoke script asserts stock is unchanged after a forced failure.</w:t>
+        <w:t xml:space="preserve">Commits 20-22</w:t>
+      </w:r>
+      <w:r>
+        <w:t xml:space="preserve"> - login brand panel, Users and Access page wired to register, offline register support.</w:t>
       </w:r>
     </w:p>
     <w:p>
@@ -12294,46 +12248,10 @@
           <w:b/>
           <w:bCs/>
         </w:rPr>
-        <w:t>Test DB pollution</w:t>
-      </w:r>
-      <w:r>
-        <w:t xml:space="preserve"> - MockMvc tests shared one H2 database and leaked the logged-in user across tests (SecurityContext is thread-local). Solved: </w:t>
-      </w:r>
-      <w:r>
-        <w:rPr>
-          <w:rFonts w:ascii="Consolas" w:eastAsia="Consolas" w:hAnsi="Consolas" w:cs="Consolas"/>
-          <w:color w:val="B03A2E"/>
-          <w:sz w:val="20"/>
-          <w:szCs w:val="20"/>
-        </w:rPr>
-        <w:t>@Transactional</w:t>
-      </w:r>
-      <w:r>
-        <w:t xml:space="preserve"> rollback on every test class + </w:t>
-      </w:r>
-      <w:r>
-        <w:rPr>
-          <w:rFonts w:ascii="Consolas" w:eastAsia="Consolas" w:hAnsi="Consolas" w:cs="Consolas"/>
-          <w:color w:val="B03A2E"/>
-          <w:sz w:val="20"/>
-          <w:szCs w:val="20"/>
-        </w:rPr>
-        <w:t>SecurityContextHolder.clearContext()</w:t>
-      </w:r>
-      <w:r>
-        <w:t xml:space="preserve"> in </w:t>
-      </w:r>
-      <w:r>
-        <w:rPr>
-          <w:rFonts w:ascii="Consolas" w:eastAsia="Consolas" w:hAnsi="Consolas" w:cs="Consolas"/>
-          <w:color w:val="B03A2E"/>
-          <w:sz w:val="20"/>
-          <w:szCs w:val="20"/>
-        </w:rPr>
-        <w:t>@AfterEach</w:t>
-      </w:r>
-      <w:r>
-        <w:t>.</w:t>
+        <w:t xml:space="preserve">Commits 23-25</w:t>
+      </w:r>
+      <w:r>
+        <w:t xml:space="preserve"> - multi-tenant backend (owner_id isolation, public shop registration, TenantIsolationTest), Register page, anonymous-register fix.</w:t>
       </w:r>
     </w:p>
     <w:p>
@@ -12346,27 +12264,28 @@
         <w:spacing w:after="50" w:line="264" w:lineRule="auto"/>
       </w:pPr>
       <w:r>
-        <w:rPr>
-          <w:b/>
-          <w:bCs/>
-        </w:rPr>
-        <w:t>Flaky JSON decimal asserts</w:t>
-      </w:r>
-      <w:r>
-        <w:t xml:space="preserve"> - asserting </w:t>
-      </w:r>
-      <w:r>
-        <w:rPr>
-          <w:rFonts w:ascii="Consolas" w:eastAsia="Consolas" w:hAnsi="Consolas" w:cs="Consolas"/>
-          <w:color w:val="B03A2E"/>
-          <w:sz w:val="20"/>
-          <w:szCs w:val="20"/>
-        </w:rPr>
-        <w:t>135.72</w:t>
-      </w:r>
-      <w:r>
-        <w:t xml:space="preserve"> through json-smart doubles was unstable. Solved: assert strings and integers (stock quantities, invoice numbers) instead of raw decimals.</w:t>
-      </w:r>
+        <w:t xml:space="preserve">Approach: </w:t>
+      </w:r>
+      <w:r>
+        <w:rPr>
+          <w:b/>
+          <w:bCs/>
+        </w:rPr>
+        <w:t>walking skeleton first</w:t>
+      </w:r>
+      <w:r>
+        <w:t xml:space="preserve"> - one thin slice through every layer (auth), then feature-by-feature depth (billing core after basic CRUD).</w:t>
+      </w:r>
+    </w:p>
+    <w:p>
+      <w:pPr>
+        <w:pStyle w:val="Heading2"/>
+      </w:pPr>
+      <w:bookmarkStart w:id="36" w:name="_Toc242064851"/>
+      <w:r>
+        <w:t>Challenges faced and how I solved them (from real code/commits)</w:t>
+      </w:r>
+      <w:bookmarkEnd w:id="36"/>
     </w:p>
     <w:p>
       <w:pPr>
@@ -12382,22 +12301,20 @@
           <w:b/>
           <w:bCs/>
         </w:rPr>
-        <w:t>Smoke script not re-runnable</w:t>
-      </w:r>
-      <w:r>
-        <w:t xml:space="preserve"> - it created "Filter Oil 1L" each run, so seed-count checks failed on a dirty database. Solved: documented that it needs a fresh DB (delete </w:t>
-      </w:r>
-      <w:r>
-        <w:rPr>
-          <w:rFonts w:ascii="Consolas" w:eastAsia="Consolas" w:hAnsi="Consolas" w:cs="Consolas"/>
-          <w:color w:val="B03A2E"/>
-          <w:sz w:val="20"/>
-          <w:szCs w:val="20"/>
-        </w:rPr>
-        <w:t>backend/data</w:t>
-      </w:r>
-      <w:r>
-        <w:t>, restart).</w:t>
+        <w:t>Rounding drift in GST</w:t>
+      </w:r>
+      <w:r>
+        <w:t xml:space="preserve"> - naive per-line splits could lose 0.01. Solved: divide at scale 8 then round, and give the </w:t>
+      </w:r>
+      <w:r>
+        <w:rPr>
+          <w:b/>
+          <w:bCs/>
+        </w:rPr>
+        <w:t>remainder to the last line</w:t>
+      </w:r>
+      <w:r>
+        <w:t xml:space="preserve"> so parts sum exactly.</w:t>
       </w:r>
     </w:p>
     <w:p>
@@ -12414,34 +12331,34 @@
           <w:b/>
           <w:bCs/>
         </w:rPr>
-        <w:t>Git ref corruption (real incident)</w:t>
-      </w:r>
-      <w:r>
-        <w:t xml:space="preserve"> - </w:t>
-      </w:r>
-      <w:r>
-        <w:rPr>
-          <w:rFonts w:ascii="Consolas" w:eastAsia="Consolas" w:hAnsi="Consolas" w:cs="Consolas"/>
-          <w:color w:val="B03A2E"/>
-          <w:sz w:val="20"/>
-          <w:szCs w:val="20"/>
-        </w:rPr>
-        <w:t>.git/refs/heads/master</w:t>
-      </w:r>
-      <w:r>
-        <w:t xml:space="preserve"> was accidentally zero-filled; git reported "your current branch appears to be broken". Solved: repaired the ref by writing the known commit SHA back into the file, verified with </w:t>
-      </w:r>
-      <w:r>
-        <w:rPr>
-          <w:rFonts w:ascii="Consolas" w:eastAsia="Consolas" w:hAnsi="Consolas" w:cs="Consolas"/>
-          <w:color w:val="B03A2E"/>
-          <w:sz w:val="20"/>
-          <w:szCs w:val="20"/>
-        </w:rPr>
-        <w:t>git log</w:t>
-      </w:r>
-      <w:r>
-        <w:t>. (Uncertain detail: the exact tool/command that corrupted it - I could not reproduce it.)</w:t>
+        <w:t>Two batches per product</w:t>
+      </w:r>
+      <w:r>
+        <w:t xml:space="preserve"> - a single </w:t>
+      </w:r>
+      <w:r>
+        <w:rPr>
+          <w:rFonts w:ascii="Consolas" w:eastAsia="Consolas" w:hAnsi="Consolas" w:cs="Consolas"/>
+          <w:color w:val="B03A2E"/>
+          <w:sz w:val="20"/>
+          <w:szCs w:val="20"/>
+        </w:rPr>
+        <w:t>quantity</w:t>
+      </w:r>
+      <w:r>
+        <w:t xml:space="preserve"> column could not express FEFO. Solved: </w:t>
+      </w:r>
+      <w:r>
+        <w:rPr>
+          <w:rFonts w:ascii="Consolas" w:eastAsia="Consolas" w:hAnsi="Consolas" w:cs="Consolas"/>
+          <w:color w:val="B03A2E"/>
+          <w:sz w:val="20"/>
+          <w:szCs w:val="20"/>
+        </w:rPr>
+        <w:t>stock_batch</w:t>
+      </w:r>
+      <w:r>
+        <w:t xml:space="preserve"> table + JPQL ordered by expiry; smoke test drains B1 before B2.</w:t>
       </w:r>
     </w:p>
     <w:p>
@@ -12458,92 +12375,22 @@
           <w:b/>
           <w:bCs/>
         </w:rPr>
-        <w:t>Invoice modal clipped (real bug after redesign)</w:t>
-      </w:r>
-      <w:r>
-        <w:t xml:space="preserve"> - the page wrapper used a CSS animation with </w:t>
-      </w:r>
-      <w:r>
-        <w:rPr>
-          <w:rFonts w:ascii="Consolas" w:eastAsia="Consolas" w:hAnsi="Consolas" w:cs="Consolas"/>
-          <w:color w:val="B03A2E"/>
-          <w:sz w:val="20"/>
-          <w:szCs w:val="20"/>
-        </w:rPr>
-        <w:t>fill-mode: both</w:t>
-      </w:r>
-      <w:r>
-        <w:t xml:space="preserve"> ending at </w:t>
-      </w:r>
-      <w:r>
-        <w:rPr>
-          <w:rFonts w:ascii="Consolas" w:eastAsia="Consolas" w:hAnsi="Consolas" w:cs="Consolas"/>
-          <w:color w:val="B03A2E"/>
-          <w:sz w:val="20"/>
-          <w:szCs w:val="20"/>
-        </w:rPr>
-        <w:t>transform: translateY(0)</w:t>
-      </w:r>
-      <w:r>
-        <w:t xml:space="preserve">. That invisible transform made the wrapper the containing block for </w:t>
-      </w:r>
-      <w:r>
-        <w:rPr>
-          <w:rFonts w:ascii="Consolas" w:eastAsia="Consolas" w:hAnsi="Consolas" w:cs="Consolas"/>
-          <w:color w:val="B03A2E"/>
-          <w:sz w:val="20"/>
-          <w:szCs w:val="20"/>
-        </w:rPr>
-        <w:t>position: fixed</w:t>
-      </w:r>
-      <w:r>
-        <w:t xml:space="preserve">, so the modal was trapped inside page content. Solved: end keyframes at </w:t>
-      </w:r>
-      <w:r>
-        <w:rPr>
-          <w:rFonts w:ascii="Consolas" w:eastAsia="Consolas" w:hAnsi="Consolas" w:cs="Consolas"/>
-          <w:color w:val="B03A2E"/>
-          <w:sz w:val="20"/>
-          <w:szCs w:val="20"/>
-        </w:rPr>
-        <w:t>transform: none</w:t>
-      </w:r>
-      <w:r>
-        <w:t xml:space="preserve"> </w:t>
-      </w:r>
-      <w:r>
-        <w:rPr>
-          <w:b/>
-          <w:bCs/>
-        </w:rPr>
-        <w:t>and</w:t>
-      </w:r>
-      <w:r>
-        <w:t xml:space="preserve"> render </w:t>
-      </w:r>
-      <w:r>
-        <w:rPr>
-          <w:rFonts w:ascii="Consolas" w:eastAsia="Consolas" w:hAnsi="Consolas" w:cs="Consolas"/>
-          <w:color w:val="B03A2E"/>
-          <w:sz w:val="20"/>
-          <w:szCs w:val="20"/>
-        </w:rPr>
-        <w:t>Modal</w:t>
-      </w:r>
-      <w:r>
-        <w:t xml:space="preserve"> through </w:t>
-      </w:r>
-      <w:r>
-        <w:rPr>
-          <w:rFonts w:ascii="Consolas" w:eastAsia="Consolas" w:hAnsi="Consolas" w:cs="Consolas"/>
-          <w:color w:val="B03A2E"/>
-          <w:sz w:val="20"/>
-          <w:szCs w:val="20"/>
-        </w:rPr>
-        <w:t>createPortal(..., document.body)</w:t>
-      </w:r>
-      <w:r>
-        <w:t xml:space="preserve"> so no ancestor can ever clip it.</w:t>
+        <w:t>Rollback proof</w:t>
+      </w:r>
+      <w:r>
+        <w:t xml:space="preserve"> - if stock deducts but the invoice fails, the shop loses stock. Solved: everything inside one </w:t>
+      </w:r>
+      <w:r>
+        <w:rPr>
+          <w:rFonts w:ascii="Consolas" w:eastAsia="Consolas" w:hAnsi="Consolas" w:cs="Consolas"/>
+          <w:color w:val="B03A2E"/>
+          <w:sz w:val="20"/>
+          <w:szCs w:val="20"/>
+        </w:rPr>
+        <w:t>@Transactional</w:t>
+      </w:r>
+      <w:r>
+        <w:t xml:space="preserve"> method; smoke script asserts stock is unchanged after a forced failure.</w:t>
       </w:r>
     </w:p>
     <w:p>
@@ -12560,6 +12407,272 @@
           <w:b/>
           <w:bCs/>
         </w:rPr>
+        <w:t>Test DB pollution</w:t>
+      </w:r>
+      <w:r>
+        <w:t xml:space="preserve"> - MockMvc tests shared one H2 database and leaked the logged-in user across tests (SecurityContext is thread-local). Solved: </w:t>
+      </w:r>
+      <w:r>
+        <w:rPr>
+          <w:rFonts w:ascii="Consolas" w:eastAsia="Consolas" w:hAnsi="Consolas" w:cs="Consolas"/>
+          <w:color w:val="B03A2E"/>
+          <w:sz w:val="20"/>
+          <w:szCs w:val="20"/>
+        </w:rPr>
+        <w:t>@Transactional</w:t>
+      </w:r>
+      <w:r>
+        <w:t xml:space="preserve"> rollback on every test class + </w:t>
+      </w:r>
+      <w:r>
+        <w:rPr>
+          <w:rFonts w:ascii="Consolas" w:eastAsia="Consolas" w:hAnsi="Consolas" w:cs="Consolas"/>
+          <w:color w:val="B03A2E"/>
+          <w:sz w:val="20"/>
+          <w:szCs w:val="20"/>
+        </w:rPr>
+        <w:t>SecurityContextHolder.clearContext()</w:t>
+      </w:r>
+      <w:r>
+        <w:t xml:space="preserve"> in </w:t>
+      </w:r>
+      <w:r>
+        <w:rPr>
+          <w:rFonts w:ascii="Consolas" w:eastAsia="Consolas" w:hAnsi="Consolas" w:cs="Consolas"/>
+          <w:color w:val="B03A2E"/>
+          <w:sz w:val="20"/>
+          <w:szCs w:val="20"/>
+        </w:rPr>
+        <w:t>@AfterEach</w:t>
+      </w:r>
+      <w:r>
+        <w:t>.</w:t>
+      </w:r>
+    </w:p>
+    <w:p>
+      <w:pPr>
+        <w:pStyle w:val="ListParagraph"/>
+        <w:numPr>
+          <w:ilvl w:val="0"/>
+          <w:numId w:val="2"/>
+        </w:numPr>
+        <w:spacing w:after="50" w:line="264" w:lineRule="auto"/>
+      </w:pPr>
+      <w:r>
+        <w:rPr>
+          <w:b/>
+          <w:bCs/>
+        </w:rPr>
+        <w:t>Flaky JSON decimal asserts</w:t>
+      </w:r>
+      <w:r>
+        <w:t xml:space="preserve"> - asserting </w:t>
+      </w:r>
+      <w:r>
+        <w:rPr>
+          <w:rFonts w:ascii="Consolas" w:eastAsia="Consolas" w:hAnsi="Consolas" w:cs="Consolas"/>
+          <w:color w:val="B03A2E"/>
+          <w:sz w:val="20"/>
+          <w:szCs w:val="20"/>
+        </w:rPr>
+        <w:t>135.72</w:t>
+      </w:r>
+      <w:r>
+        <w:t xml:space="preserve"> through json-smart doubles was unstable. Solved: assert strings and integers (stock quantities, invoice numbers) instead of raw decimals.</w:t>
+      </w:r>
+    </w:p>
+    <w:p>
+      <w:pPr>
+        <w:pStyle w:val="ListParagraph"/>
+        <w:numPr>
+          <w:ilvl w:val="0"/>
+          <w:numId w:val="2"/>
+        </w:numPr>
+        <w:spacing w:after="50" w:line="264" w:lineRule="auto"/>
+      </w:pPr>
+      <w:r>
+        <w:rPr>
+          <w:b/>
+          <w:bCs/>
+        </w:rPr>
+        <w:t>Smoke script not re-runnable</w:t>
+      </w:r>
+      <w:r>
+        <w:t xml:space="preserve"> - it created "Filter Oil 1L" each run, so seed-count checks failed on a dirty database. Solved: documented that it needs a fresh DB (delete </w:t>
+      </w:r>
+      <w:r>
+        <w:rPr>
+          <w:rFonts w:ascii="Consolas" w:eastAsia="Consolas" w:hAnsi="Consolas" w:cs="Consolas"/>
+          <w:color w:val="B03A2E"/>
+          <w:sz w:val="20"/>
+          <w:szCs w:val="20"/>
+        </w:rPr>
+        <w:t>backend/data</w:t>
+      </w:r>
+      <w:r>
+        <w:t>, restart).</w:t>
+      </w:r>
+    </w:p>
+    <w:p>
+      <w:pPr>
+        <w:pStyle w:val="ListParagraph"/>
+        <w:numPr>
+          <w:ilvl w:val="0"/>
+          <w:numId w:val="2"/>
+        </w:numPr>
+        <w:spacing w:after="50" w:line="264" w:lineRule="auto"/>
+      </w:pPr>
+      <w:r>
+        <w:rPr>
+          <w:b/>
+          <w:bCs/>
+        </w:rPr>
+        <w:t>Git ref corruption (real incident)</w:t>
+      </w:r>
+      <w:r>
+        <w:t xml:space="preserve"> - </w:t>
+      </w:r>
+      <w:r>
+        <w:rPr>
+          <w:rFonts w:ascii="Consolas" w:eastAsia="Consolas" w:hAnsi="Consolas" w:cs="Consolas"/>
+          <w:color w:val="B03A2E"/>
+          <w:sz w:val="20"/>
+          <w:szCs w:val="20"/>
+        </w:rPr>
+        <w:t>.git/refs/heads/master</w:t>
+      </w:r>
+      <w:r>
+        <w:t xml:space="preserve"> was accidentally zero-filled; git reported "your current branch appears to be broken". Solved: repaired the ref by writing the known commit SHA back into the file, verified with </w:t>
+      </w:r>
+      <w:r>
+        <w:rPr>
+          <w:rFonts w:ascii="Consolas" w:eastAsia="Consolas" w:hAnsi="Consolas" w:cs="Consolas"/>
+          <w:color w:val="B03A2E"/>
+          <w:sz w:val="20"/>
+          <w:szCs w:val="20"/>
+        </w:rPr>
+        <w:t>git log</w:t>
+      </w:r>
+      <w:r>
+        <w:t>. (Uncertain detail: the exact tool/command that corrupted it - I could not reproduce it.)</w:t>
+      </w:r>
+    </w:p>
+    <w:p>
+      <w:pPr>
+        <w:pStyle w:val="ListParagraph"/>
+        <w:numPr>
+          <w:ilvl w:val="0"/>
+          <w:numId w:val="2"/>
+        </w:numPr>
+        <w:spacing w:after="50" w:line="264" w:lineRule="auto"/>
+      </w:pPr>
+      <w:r>
+        <w:rPr>
+          <w:b/>
+          <w:bCs/>
+        </w:rPr>
+        <w:t>Invoice modal clipped (real bug after redesign)</w:t>
+      </w:r>
+      <w:r>
+        <w:t xml:space="preserve"> - the page wrapper used a CSS animation with </w:t>
+      </w:r>
+      <w:r>
+        <w:rPr>
+          <w:rFonts w:ascii="Consolas" w:eastAsia="Consolas" w:hAnsi="Consolas" w:cs="Consolas"/>
+          <w:color w:val="B03A2E"/>
+          <w:sz w:val="20"/>
+          <w:szCs w:val="20"/>
+        </w:rPr>
+        <w:t>fill-mode: both</w:t>
+      </w:r>
+      <w:r>
+        <w:t xml:space="preserve"> ending at </w:t>
+      </w:r>
+      <w:r>
+        <w:rPr>
+          <w:rFonts w:ascii="Consolas" w:eastAsia="Consolas" w:hAnsi="Consolas" w:cs="Consolas"/>
+          <w:color w:val="B03A2E"/>
+          <w:sz w:val="20"/>
+          <w:szCs w:val="20"/>
+        </w:rPr>
+        <w:t>transform: translateY(0)</w:t>
+      </w:r>
+      <w:r>
+        <w:t xml:space="preserve">. That invisible transform made the wrapper the containing block for </w:t>
+      </w:r>
+      <w:r>
+        <w:rPr>
+          <w:rFonts w:ascii="Consolas" w:eastAsia="Consolas" w:hAnsi="Consolas" w:cs="Consolas"/>
+          <w:color w:val="B03A2E"/>
+          <w:sz w:val="20"/>
+          <w:szCs w:val="20"/>
+        </w:rPr>
+        <w:t>position: fixed</w:t>
+      </w:r>
+      <w:r>
+        <w:t xml:space="preserve">, so the modal was trapped inside page content. Solved: end keyframes at </w:t>
+      </w:r>
+      <w:r>
+        <w:rPr>
+          <w:rFonts w:ascii="Consolas" w:eastAsia="Consolas" w:hAnsi="Consolas" w:cs="Consolas"/>
+          <w:color w:val="B03A2E"/>
+          <w:sz w:val="20"/>
+          <w:szCs w:val="20"/>
+        </w:rPr>
+        <w:t>transform: none</w:t>
+      </w:r>
+      <w:r>
+        <w:t xml:space="preserve"> </w:t>
+      </w:r>
+      <w:r>
+        <w:rPr>
+          <w:b/>
+          <w:bCs/>
+        </w:rPr>
+        <w:t>and</w:t>
+      </w:r>
+      <w:r>
+        <w:t xml:space="preserve"> render </w:t>
+      </w:r>
+      <w:r>
+        <w:rPr>
+          <w:rFonts w:ascii="Consolas" w:eastAsia="Consolas" w:hAnsi="Consolas" w:cs="Consolas"/>
+          <w:color w:val="B03A2E"/>
+          <w:sz w:val="20"/>
+          <w:szCs w:val="20"/>
+        </w:rPr>
+        <w:t>Modal</w:t>
+      </w:r>
+      <w:r>
+        <w:t xml:space="preserve"> through </w:t>
+      </w:r>
+      <w:r>
+        <w:rPr>
+          <w:rFonts w:ascii="Consolas" w:eastAsia="Consolas" w:hAnsi="Consolas" w:cs="Consolas"/>
+          <w:color w:val="B03A2E"/>
+          <w:sz w:val="20"/>
+          <w:szCs w:val="20"/>
+        </w:rPr>
+        <w:t>createPortal(..., document.body)</w:t>
+      </w:r>
+      <w:r>
+        <w:t xml:space="preserve"> so no ancestor can ever clip it.</w:t>
+      </w:r>
+    </w:p>
+    <w:p>
+      <w:pPr>
+        <w:pStyle w:val="ListParagraph"/>
+        <w:numPr>
+          <w:ilvl w:val="0"/>
+          <w:numId w:val="2"/>
+        </w:numPr>
+        <w:spacing w:after="50" w:line="264" w:lineRule="auto"/>
+      </w:pPr>
+      <w:r>
+        <w:rPr>
+          <w:b/>
+          <w:bCs/>
+        </w:rPr>
         <w:t>jjwt 0.11.5 API trap</w:t>
       </w:r>
       <w:r>
@@ -12588,6 +12701,74 @@
       </w:r>
       <w:r>
         <w:t xml:space="preserve"> or it throws. Noted in DECISIONS.md so I answer it from memory.</w:t>
+      </w:r>
+    </w:p>
+    <w:p>
+      <w:pPr>
+        <w:pStyle w:val="ListParagraph"/>
+        <w:numPr>
+          <w:ilvl w:val="0"/>
+          <w:numId w:val="2"/>
+        </w:numPr>
+        <w:spacing w:after="50" w:line="264" w:lineRule="auto"/>
+      </w:pPr>
+      <w:r>
+        <w:rPr>
+          <w:b/>
+          <w:bCs/>
+        </w:rPr>
+        <w:t xml:space="preserve">Multi-tenancy retrofit</w:t>
+      </w:r>
+      <w:r>
+        <w:t xml:space="preserve"> - adding </w:t>
+      </w:r>
+      <w:r>
+        <w:rPr>
+          <w:rFonts w:ascii="Consolas" w:eastAsia="Consolas" w:hAnsi="Consolas" w:cs="Consolas"/>
+          <w:color w:val="B03A2E"/>
+          <w:sz w:val="20"/>
+          <w:szCs w:val="20"/>
+        </w:rPr>
+        <w:t xml:space="preserve">owner_id</w:t>
+      </w:r>
+      <w:r>
+        <w:t xml:space="preserve"> after the fact meant touching every repository query and service. Solved: </w:t>
+      </w:r>
+      <w:r>
+        <w:rPr>
+          <w:rFonts w:ascii="Consolas" w:eastAsia="Consolas" w:hAnsi="Consolas" w:cs="Consolas"/>
+          <w:color w:val="B03A2E"/>
+          <w:sz w:val="20"/>
+          <w:szCs w:val="20"/>
+        </w:rPr>
+        <w:t xml:space="preserve">AppUserDetails</w:t>
+      </w:r>
+      <w:r>
+        <w:t xml:space="preserve"> carries the tenant id in the principal, </w:t>
+      </w:r>
+      <w:r>
+        <w:rPr>
+          <w:rFonts w:ascii="Consolas" w:eastAsia="Consolas" w:hAnsi="Consolas" w:cs="Consolas"/>
+          <w:color w:val="B03A2E"/>
+          <w:sz w:val="20"/>
+          <w:szCs w:val="20"/>
+        </w:rPr>
+        <w:t xml:space="preserve">CurrentTenant.id()</w:t>
+      </w:r>
+      <w:r>
+        <w:t xml:space="preserve"> feeds each scoped query, cross-tenant reads answer 404. Locked in with </w:t>
+      </w:r>
+      <w:r>
+        <w:rPr>
+          <w:rFonts w:ascii="Consolas" w:eastAsia="Consolas" w:hAnsi="Consolas" w:cs="Consolas"/>
+          <w:color w:val="B03A2E"/>
+          <w:sz w:val="20"/>
+          <w:szCs w:val="20"/>
+        </w:rPr>
+        <w:t xml:space="preserve">TenantIsolationTest</w:t>
+      </w:r>
+      <w:r>
+        <w:t xml:space="preserve"> (6 tests).</w:t>
       </w:r>
     </w:p>
     <w:p>
@@ -12634,7 +12815,7 @@
         <w:spacing w:after="50" w:line="264" w:lineRule="auto"/>
       </w:pPr>
       <w:r>
-        <w:t xml:space="preserve">12 commits, </w:t>
+        <w:t xml:space="preserve">25 commits, </w:t>
       </w:r>
       <w:r>
         <w:rPr>
@@ -13020,6 +13201,62 @@
       </w:r>
       <w:r>
         <w:t xml:space="preserve"> as the safety net.</w:t>
+      </w:r>
+    </w:p>
+    <w:p>
+      <w:pPr>
+        <w:pStyle w:val="ListParagraph"/>
+        <w:numPr>
+          <w:ilvl w:val="0"/>
+          <w:numId w:val="2"/>
+        </w:numPr>
+        <w:spacing w:after="50" w:line="264" w:lineRule="auto"/>
+      </w:pPr>
+      <w:r>
+        <w:rPr>
+          <w:b/>
+          <w:bCs/>
+        </w:rPr>
+        <w:t xml:space="preserve">Tenant isolation</w:t>
+      </w:r>
+      <w:r>
+        <w:t xml:space="preserve"> - every service reads the caller's shop id from </w:t>
+      </w:r>
+      <w:r>
+        <w:rPr>
+          <w:rFonts w:ascii="Consolas" w:eastAsia="Consolas" w:hAnsi="Consolas" w:cs="Consolas"/>
+          <w:color w:val="B03A2E"/>
+          <w:sz w:val="20"/>
+          <w:szCs w:val="20"/>
+        </w:rPr>
+        <w:t xml:space="preserve">CurrentTenant.id()</w:t>
+      </w:r>
+      <w:r>
+        <w:t xml:space="preserve"> and passes </w:t>
+      </w:r>
+      <w:r>
+        <w:rPr>
+          <w:rFonts w:ascii="Consolas" w:eastAsia="Consolas" w:hAnsi="Consolas" w:cs="Consolas"/>
+          <w:color w:val="B03A2E"/>
+          <w:sz w:val="20"/>
+          <w:szCs w:val="20"/>
+        </w:rPr>
+        <w:t xml:space="preserve">owner_id</w:t>
+      </w:r>
+      <w:r>
+        <w:t xml:space="preserve"> into each query; a cross-tenant id returns the same 404 as a missing row, so enumeration leaks nothing (</w:t>
+      </w:r>
+      <w:r>
+        <w:rPr>
+          <w:rFonts w:ascii="Consolas" w:eastAsia="Consolas" w:hAnsi="Consolas" w:cs="Consolas"/>
+          <w:color w:val="B03A2E"/>
+          <w:sz w:val="20"/>
+          <w:szCs w:val="20"/>
+        </w:rPr>
+        <w:t xml:space="preserve">TenantIsolationTest</w:t>
+      </w:r>
+      <w:r>
+        <w:t xml:space="preserve">). The frontend never chooses the shop - it is derived from the JWT.</w:t>
       </w:r>
     </w:p>
     <w:p>
@@ -13761,7 +13998,7 @@
       </w:pPr>
       <w:bookmarkStart w:id="43" w:name="_Toc242064858"/>
       <w:r>
-        <w:t>Automated tests: 25 in 8 classes (brief asked 15)</w:t>
+        <w:t>Automated tests: 34 in 9 classes (brief asked 15)</w:t>
       </w:r>
       <w:bookmarkEnd w:id="43"/>
     </w:p>
@@ -13819,10 +14056,10 @@
           <w:b/>
           <w:bCs/>
         </w:rPr>
-        <w:t>AuthControllerTest (4)</w:t>
-      </w:r>
-      <w:r>
-        <w:t xml:space="preserve"> - register bootstrap, login success, wrong password 401, token shape.</w:t>
+        <w:t>AuthControllerTest (7)</w:t>
+      </w:r>
+      <w:r>
+        <w:t xml:space="preserve"> - login success, wrong password 401, and the five register rules (anonymous owner 201, anonymous staff 403, owner token cannot mint an owner, staff token 403, owner adds staff 201).</w:t>
       </w:r>
     </w:p>
     <w:p>
@@ -13859,10 +14096,10 @@
           <w:b/>
           <w:bCs/>
         </w:rPr>
-        <w:t>ProductApiTest (4)</w:t>
-      </w:r>
-      <w:r>
-        <w:t xml:space="preserve"> - create/list/search/pagination/validation 400.</w:t>
+        <w:t xml:space="preserve">TenantIsolationTest (6)</w:t>
+      </w:r>
+      <w:r>
+        <w:t xml:space="preserve"> - two owners cannot read each other's invoices or bill against each other's products, category names unique per shop, staff scoped to their owner's shop, reports scoped to the shop.</w:t>
       </w:r>
     </w:p>
     <w:p>
@@ -13879,10 +14116,10 @@
           <w:b/>
           <w:bCs/>
         </w:rPr>
-        <w:t>InvoiceBillingTest (4)</w:t>
-      </w:r>
-      <w:r>
-        <w:t xml:space="preserve"> - GST/discount math, FEFO across two batches, insufficient stock rollback, invoice number.</w:t>
+        <w:t>ProductApiTest (4)</w:t>
+      </w:r>
+      <w:r>
+        <w:t xml:space="preserve"> - create/list/search/pagination/validation 400.</w:t>
       </w:r>
     </w:p>
     <w:p>
@@ -13899,22 +14136,10 @@
           <w:b/>
           <w:bCs/>
         </w:rPr>
-        <w:t>PdfServiceTest (1)</w:t>
-      </w:r>
-      <w:r>
-        <w:t xml:space="preserve"> - PDF bytes start with </w:t>
-      </w:r>
-      <w:r>
-        <w:rPr>
-          <w:rFonts w:ascii="Consolas" w:eastAsia="Consolas" w:hAnsi="Consolas" w:cs="Consolas"/>
-          <w:color w:val="B03A2E"/>
-          <w:sz w:val="20"/>
-          <w:szCs w:val="20"/>
-        </w:rPr>
-        <w:t>%PDF</w:t>
-      </w:r>
-      <w:r>
-        <w:t xml:space="preserve"> and contain content.</w:t>
+        <w:t>InvoiceBillingTest (4)</w:t>
+      </w:r>
+      <w:r>
+        <w:t xml:space="preserve"> - GST/discount math, FEFO across two batches, insufficient stock rollback, invoice number.</w:t>
       </w:r>
     </w:p>
     <w:p>
@@ -13931,10 +14156,22 @@
           <w:b/>
           <w:bCs/>
         </w:rPr>
-        <w:t>StockApiTest (3)</w:t>
-      </w:r>
-      <w:r>
-        <w:t xml:space="preserve"> - low stock, expiring, expired alerts.</w:t>
+        <w:t>PdfServiceTest (1)</w:t>
+      </w:r>
+      <w:r>
+        <w:t xml:space="preserve"> - PDF bytes start with </w:t>
+      </w:r>
+      <w:r>
+        <w:rPr>
+          <w:rFonts w:ascii="Consolas" w:eastAsia="Consolas" w:hAnsi="Consolas" w:cs="Consolas"/>
+          <w:color w:val="B03A2E"/>
+          <w:sz w:val="20"/>
+          <w:szCs w:val="20"/>
+        </w:rPr>
+        <w:t>%PDF</w:t>
+      </w:r>
+      <w:r>
+        <w:t xml:space="preserve"> and contain content.</w:t>
       </w:r>
     </w:p>
     <w:p>
@@ -13947,53 +14184,14 @@
         <w:spacing w:after="50" w:line="264" w:lineRule="auto"/>
       </w:pPr>
       <w:r>
-        <w:t xml:space="preserve">Technologies: </w:t>
-      </w:r>
-      <w:r>
-        <w:rPr>
-          <w:rFonts w:ascii="Consolas" w:eastAsia="Consolas" w:hAnsi="Consolas" w:cs="Consolas"/>
-          <w:color w:val="B03A2E"/>
-          <w:sz w:val="20"/>
-          <w:szCs w:val="20"/>
-        </w:rPr>
-        <w:t>@SpringBootTest</w:t>
-      </w:r>
-      <w:r>
-        <w:t xml:space="preserve"> + </w:t>
-      </w:r>
-      <w:r>
-        <w:rPr>
-          <w:b/>
-          <w:bCs/>
-        </w:rPr>
-        <w:t>MockMvc</w:t>
-      </w:r>
-      <w:r>
-        <w:t xml:space="preserve"> (full context, no real server), </w:t>
-      </w:r>
-      <w:r>
-        <w:rPr>
-          <w:rFonts w:ascii="Consolas" w:eastAsia="Consolas" w:hAnsi="Consolas" w:cs="Consolas"/>
-          <w:color w:val="B03A2E"/>
-          <w:sz w:val="20"/>
-          <w:szCs w:val="20"/>
-        </w:rPr>
-        <w:t>@DataJpaTest</w:t>
-      </w:r>
-      <w:r>
-        <w:t xml:space="preserve">-style assertions inside service tests, </w:t>
-      </w:r>
-      <w:r>
-        <w:rPr>
-          <w:rFonts w:ascii="Consolas" w:eastAsia="Consolas" w:hAnsi="Consolas" w:cs="Consolas"/>
-          <w:color w:val="B03A2E"/>
-          <w:sz w:val="20"/>
-          <w:szCs w:val="20"/>
-        </w:rPr>
-        <w:t>spring-security-test</w:t>
-      </w:r>
-      <w:r>
-        <w:t xml:space="preserve"> where needed.</w:t>
+        <w:rPr>
+          <w:b/>
+          <w:bCs/>
+        </w:rPr>
+        <w:t>StockApiTest (3)</w:t>
+      </w:r>
+      <w:r>
+        <w:t xml:space="preserve"> - low stock, expiring, expired alerts.</w:t>
       </w:r>
     </w:p>
     <w:p>
@@ -14006,65 +14204,53 @@
         <w:spacing w:after="50" w:line="264" w:lineRule="auto"/>
       </w:pPr>
       <w:r>
-        <w:t xml:space="preserve">Test config: </w:t>
-      </w:r>
-      <w:r>
-        <w:rPr>
-          <w:rFonts w:ascii="Consolas" w:eastAsia="Consolas" w:hAnsi="Consolas" w:cs="Consolas"/>
-          <w:color w:val="B03A2E"/>
-          <w:sz w:val="20"/>
-          <w:szCs w:val="20"/>
-        </w:rPr>
-        <w:t>src/test/resources/application-test.properties</w:t>
-      </w:r>
-      <w:r>
-        <w:t xml:space="preserve"> - in-memory H2 (</w:t>
-      </w:r>
-      <w:r>
-        <w:rPr>
-          <w:rFonts w:ascii="Consolas" w:eastAsia="Consolas" w:hAnsi="Consolas" w:cs="Consolas"/>
-          <w:color w:val="B03A2E"/>
-          <w:sz w:val="20"/>
-          <w:szCs w:val="20"/>
-        </w:rPr>
-        <w:t>jdbc:h2:mem:munimji-test;MODE=MySQL;DB_CLOSE_DELAY=-1</w:t>
-      </w:r>
-      <w:r>
-        <w:t xml:space="preserve">), </w:t>
-      </w:r>
-      <w:r>
-        <w:rPr>
-          <w:rFonts w:ascii="Consolas" w:eastAsia="Consolas" w:hAnsi="Consolas" w:cs="Consolas"/>
-          <w:color w:val="B03A2E"/>
-          <w:sz w:val="20"/>
-          <w:szCs w:val="20"/>
-        </w:rPr>
-        <w:t>ddl-auto=create-drop</w:t>
-      </w:r>
-      <w:r>
-        <w:t xml:space="preserve">, seed still runs. Result: </w:t>
-      </w:r>
-      <w:r>
-        <w:rPr>
-          <w:rFonts w:ascii="Consolas" w:eastAsia="Consolas" w:hAnsi="Consolas" w:cs="Consolas"/>
-          <w:color w:val="B03A2E"/>
-          <w:sz w:val="20"/>
-          <w:szCs w:val="20"/>
-        </w:rPr>
-        <w:t>mvn clean test</w:t>
-      </w:r>
-      <w:r>
-        <w:t xml:space="preserve"> -&gt; </w:t>
-      </w:r>
-      <w:r>
-        <w:rPr>
-          <w:b/>
-          <w:bCs/>
-        </w:rPr>
-        <w:t>Tests run: 25, Failures: 0, Errors: 0</w:t>
-      </w:r>
-      <w:r>
-        <w:t>.</w:t>
+        <w:t xml:space="preserve">Technologies: </w:t>
+      </w:r>
+      <w:r>
+        <w:rPr>
+          <w:rFonts w:ascii="Consolas" w:eastAsia="Consolas" w:hAnsi="Consolas" w:cs="Consolas"/>
+          <w:color w:val="B03A2E"/>
+          <w:sz w:val="20"/>
+          <w:szCs w:val="20"/>
+        </w:rPr>
+        <w:t>@SpringBootTest</w:t>
+      </w:r>
+      <w:r>
+        <w:t xml:space="preserve"> + </w:t>
+      </w:r>
+      <w:r>
+        <w:rPr>
+          <w:b/>
+          <w:bCs/>
+        </w:rPr>
+        <w:t>MockMvc</w:t>
+      </w:r>
+      <w:r>
+        <w:t xml:space="preserve"> (full context, no real server), </w:t>
+      </w:r>
+      <w:r>
+        <w:rPr>
+          <w:rFonts w:ascii="Consolas" w:eastAsia="Consolas" w:hAnsi="Consolas" w:cs="Consolas"/>
+          <w:color w:val="B03A2E"/>
+          <w:sz w:val="20"/>
+          <w:szCs w:val="20"/>
+        </w:rPr>
+        <w:t>@DataJpaTest</w:t>
+      </w:r>
+      <w:r>
+        <w:t xml:space="preserve">-style assertions inside service tests, </w:t>
+      </w:r>
+      <w:r>
+        <w:rPr>
+          <w:rFonts w:ascii="Consolas" w:eastAsia="Consolas" w:hAnsi="Consolas" w:cs="Consolas"/>
+          <w:color w:val="B03A2E"/>
+          <w:sz w:val="20"/>
+          <w:szCs w:val="20"/>
+        </w:rPr>
+        <w:t>spring-security-test</w:t>
+      </w:r>
+      <w:r>
+        <w:t xml:space="preserve"> where needed.</w:t>
       </w:r>
     </w:p>
     <w:p>
@@ -14077,54 +14263,66 @@
         <w:spacing w:after="50" w:line="264" w:lineRule="auto"/>
       </w:pPr>
       <w:r>
-        <w:t xml:space="preserve">Every test class is </w:t>
-      </w:r>
-      <w:r>
-        <w:rPr>
-          <w:rFonts w:ascii="Consolas" w:eastAsia="Consolas" w:hAnsi="Consolas" w:cs="Consolas"/>
-          <w:color w:val="B03A2E"/>
-          <w:sz w:val="20"/>
-          <w:szCs w:val="20"/>
-        </w:rPr>
-        <w:t>@Transactional</w:t>
-      </w:r>
-      <w:r>
-        <w:t xml:space="preserve"> (rolls back after each test) and clears </w:t>
-      </w:r>
-      <w:r>
-        <w:rPr>
-          <w:rFonts w:ascii="Consolas" w:eastAsia="Consolas" w:hAnsi="Consolas" w:cs="Consolas"/>
-          <w:color w:val="B03A2E"/>
-          <w:sz w:val="20"/>
-          <w:szCs w:val="20"/>
-        </w:rPr>
-        <w:t>SecurityContextHolder</w:t>
-      </w:r>
-      <w:r>
-        <w:t xml:space="preserve"> in </w:t>
-      </w:r>
-      <w:r>
-        <w:rPr>
-          <w:rFonts w:ascii="Consolas" w:eastAsia="Consolas" w:hAnsi="Consolas" w:cs="Consolas"/>
-          <w:color w:val="B03A2E"/>
-          <w:sz w:val="20"/>
-          <w:szCs w:val="20"/>
-        </w:rPr>
-        <w:t>@AfterEach</w:t>
+        <w:t xml:space="preserve">Test config: </w:t>
+      </w:r>
+      <w:r>
+        <w:rPr>
+          <w:rFonts w:ascii="Consolas" w:eastAsia="Consolas" w:hAnsi="Consolas" w:cs="Consolas"/>
+          <w:color w:val="B03A2E"/>
+          <w:sz w:val="20"/>
+          <w:szCs w:val="20"/>
+        </w:rPr>
+        <w:t>src/test/resources/application-test.properties</w:t>
+      </w:r>
+      <w:r>
+        <w:t xml:space="preserve"> - in-memory H2 (</w:t>
+      </w:r>
+      <w:r>
+        <w:rPr>
+          <w:rFonts w:ascii="Consolas" w:eastAsia="Consolas" w:hAnsi="Consolas" w:cs="Consolas"/>
+          <w:color w:val="B03A2E"/>
+          <w:sz w:val="20"/>
+          <w:szCs w:val="20"/>
+        </w:rPr>
+        <w:t>jdbc:h2:mem:munimji-test;MODE=MySQL;DB_CLOSE_DELAY=-1</w:t>
+      </w:r>
+      <w:r>
+        <w:t xml:space="preserve">), </w:t>
+      </w:r>
+      <w:r>
+        <w:rPr>
+          <w:rFonts w:ascii="Consolas" w:eastAsia="Consolas" w:hAnsi="Consolas" w:cs="Consolas"/>
+          <w:color w:val="B03A2E"/>
+          <w:sz w:val="20"/>
+          <w:szCs w:val="20"/>
+        </w:rPr>
+        <w:t>ddl-auto=create-drop</w:t>
+      </w:r>
+      <w:r>
+        <w:t xml:space="preserve">, seed still runs. Result: </w:t>
+      </w:r>
+      <w:r>
+        <w:rPr>
+          <w:rFonts w:ascii="Consolas" w:eastAsia="Consolas" w:hAnsi="Consolas" w:cs="Consolas"/>
+          <w:color w:val="B03A2E"/>
+          <w:sz w:val="20"/>
+          <w:szCs w:val="20"/>
+        </w:rPr>
+        <w:t>mvn clean test</w:t>
+      </w:r>
+      <w:r>
+        <w:t xml:space="preserve"> -&gt; </w:t>
+      </w:r>
+      <w:r>
+        <w:rPr>
+          <w:b/>
+          <w:bCs/>
+        </w:rPr>
+        <w:t>Tests run: 34, Failures: 0, Errors: 0</w:t>
       </w:r>
       <w:r>
         <w:t>.</w:t>
       </w:r>
-    </w:p>
-    <w:p>
-      <w:pPr>
-        <w:pStyle w:val="Heading2"/>
-      </w:pPr>
-      <w:bookmarkStart w:id="44" w:name="_Toc242064859"/>
-      <w:r>
-        <w:t>End-to-end smoke test (the definition-of-done script)</w:t>
-      </w:r>
-      <w:bookmarkEnd w:id="44"/>
     </w:p>
     <w:p>
       <w:pPr>
@@ -14136,39 +14334,54 @@
         <w:spacing w:after="50" w:line="264" w:lineRule="auto"/>
       </w:pPr>
       <w:r>
-        <w:rPr>
-          <w:rFonts w:ascii="Consolas" w:eastAsia="Consolas" w:hAnsi="Consolas" w:cs="Consolas"/>
-          <w:color w:val="B03A2E"/>
-          <w:sz w:val="20"/>
-          <w:szCs w:val="20"/>
-        </w:rPr>
-        <w:t>scripts/smoke-test.ps1</w:t>
-      </w:r>
-      <w:r>
-        <w:t xml:space="preserve"> - PowerShell + </w:t>
-      </w:r>
-      <w:r>
-        <w:rPr>
-          <w:rFonts w:ascii="Consolas" w:eastAsia="Consolas" w:hAnsi="Consolas" w:cs="Consolas"/>
-          <w:color w:val="B03A2E"/>
-          <w:sz w:val="20"/>
-          <w:szCs w:val="20"/>
-        </w:rPr>
-        <w:t>curl.exe</w:t>
-      </w:r>
-      <w:r>
-        <w:t xml:space="preserve">, </w:t>
-      </w:r>
-      <w:r>
-        <w:rPr>
-          <w:b/>
-          <w:bCs/>
-        </w:rPr>
-        <w:t>59 checks</w:t>
-      </w:r>
-      <w:r>
-        <w:t>, exit code 0 only if all pass.</w:t>
-      </w:r>
+        <w:t xml:space="preserve">Every test class is </w:t>
+      </w:r>
+      <w:r>
+        <w:rPr>
+          <w:rFonts w:ascii="Consolas" w:eastAsia="Consolas" w:hAnsi="Consolas" w:cs="Consolas"/>
+          <w:color w:val="B03A2E"/>
+          <w:sz w:val="20"/>
+          <w:szCs w:val="20"/>
+        </w:rPr>
+        <w:t>@Transactional</w:t>
+      </w:r>
+      <w:r>
+        <w:t xml:space="preserve"> (rolls back after each test) and clears </w:t>
+      </w:r>
+      <w:r>
+        <w:rPr>
+          <w:rFonts w:ascii="Consolas" w:eastAsia="Consolas" w:hAnsi="Consolas" w:cs="Consolas"/>
+          <w:color w:val="B03A2E"/>
+          <w:sz w:val="20"/>
+          <w:szCs w:val="20"/>
+        </w:rPr>
+        <w:t>SecurityContextHolder</w:t>
+      </w:r>
+      <w:r>
+        <w:t xml:space="preserve"> in </w:t>
+      </w:r>
+      <w:r>
+        <w:rPr>
+          <w:rFonts w:ascii="Consolas" w:eastAsia="Consolas" w:hAnsi="Consolas" w:cs="Consolas"/>
+          <w:color w:val="B03A2E"/>
+          <w:sz w:val="20"/>
+          <w:szCs w:val="20"/>
+        </w:rPr>
+        <w:t>@AfterEach</w:t>
+      </w:r>
+      <w:r>
+        <w:t>.</w:t>
+      </w:r>
+    </w:p>
+    <w:p>
+      <w:pPr>
+        <w:pStyle w:val="Heading2"/>
+      </w:pPr>
+      <w:bookmarkStart w:id="44" w:name="_Toc242064859"/>
+      <w:r>
+        <w:t>End-to-end smoke test (the definition-of-done script)</w:t>
+      </w:r>
+      <w:bookmarkEnd w:id="44"/>
     </w:p>
     <w:p>
       <w:pPr>
@@ -14180,7 +14393,38 @@
         <w:spacing w:after="50" w:line="264" w:lineRule="auto"/>
       </w:pPr>
       <w:r>
-        <w:t>Covers: login -&gt; seed counts -&gt; CRUD + purchase -&gt; billing FEFO &amp; GST (190 x 12% = 22.80 split 11.40/11.40) -&gt; failure cases (insufficient stock, expired batch never sold) -&gt; STAFF role rules -&gt; PDF magic bytes -&gt; pagination -&gt; reports -&gt; invoice detail.</w:t>
+        <w:rPr>
+          <w:rFonts w:ascii="Consolas" w:eastAsia="Consolas" w:hAnsi="Consolas" w:cs="Consolas"/>
+          <w:color w:val="B03A2E"/>
+          <w:sz w:val="20"/>
+          <w:szCs w:val="20"/>
+        </w:rPr>
+        <w:t>scripts/smoke-test.ps1</w:t>
+      </w:r>
+      <w:r>
+        <w:t xml:space="preserve"> - PowerShell + </w:t>
+      </w:r>
+      <w:r>
+        <w:rPr>
+          <w:rFonts w:ascii="Consolas" w:eastAsia="Consolas" w:hAnsi="Consolas" w:cs="Consolas"/>
+          <w:color w:val="B03A2E"/>
+          <w:sz w:val="20"/>
+          <w:szCs w:val="20"/>
+        </w:rPr>
+        <w:t>curl.exe</w:t>
+      </w:r>
+      <w:r>
+        <w:t xml:space="preserve">, </w:t>
+      </w:r>
+      <w:r>
+        <w:rPr>
+          <w:b/>
+          <w:bCs/>
+        </w:rPr>
+        <w:t>62 checks</w:t>
+      </w:r>
+      <w:r>
+        <w:t>, exit code 0 only if all pass.</w:t>
       </w:r>
     </w:p>
     <w:p>
@@ -14193,17 +14437,7 @@
         <w:spacing w:after="50" w:line="264" w:lineRule="auto"/>
       </w:pPr>
       <w:r>
-        <w:t xml:space="preserve">Last run on a fresh database: </w:t>
-      </w:r>
-      <w:r>
-        <w:rPr>
-          <w:b/>
-          <w:bCs/>
-        </w:rPr>
-        <w:t>ALL 59 CHECKS PASSED</w:t>
-      </w:r>
-      <w:r>
-        <w:t xml:space="preserve"> (proof in PROGRESS.md).</w:t>
+        <w:t>Covers: login -&gt; seed counts -&gt; CRUD + purchase -&gt; billing FEFO &amp; GST (190 x 12% = 22.80 split 11.40/11.40) -&gt; failure cases (insufficient stock, expired batch never sold) -&gt; register rules (anonymous owner, owner-adds-staff, staff refused) -&gt; STAFF role rules -&gt; PDF magic bytes -&gt; pagination -&gt; reports -&gt; invoice detail.</w:t>
       </w:r>
     </w:p>
     <w:p>
@@ -14216,6 +14450,29 @@
         <w:spacing w:after="50" w:line="264" w:lineRule="auto"/>
       </w:pPr>
       <w:r>
+        <w:t xml:space="preserve">Last run on a fresh database: </w:t>
+      </w:r>
+      <w:r>
+        <w:rPr>
+          <w:b/>
+          <w:bCs/>
+        </w:rPr>
+        <w:t>ALL 62 CHECKS PASSED</w:t>
+      </w:r>
+      <w:r>
+        <w:t xml:space="preserve"> (proof in PROGRESS.md).</w:t>
+      </w:r>
+    </w:p>
+    <w:p>
+      <w:pPr>
+        <w:pStyle w:val="ListParagraph"/>
+        <w:numPr>
+          <w:ilvl w:val="0"/>
+          <w:numId w:val="2"/>
+        </w:numPr>
+        <w:spacing w:after="50" w:line="264" w:lineRule="auto"/>
+      </w:pPr>
+      <w:r>
         <w:t xml:space="preserve">It is </w:t>
       </w:r>
       <w:r>
@@ -14311,7 +14568,7 @@
           <w:sz w:val="18"/>
           <w:szCs w:val="18"/>
         </w:rPr>
-        <w:t>mvn clean test                 # 25 tests</w:t>
+        <w:t>mvn clean test                 # 34 tests</w:t>
       </w:r>
     </w:p>
     <w:p>
@@ -14778,7 +15035,7 @@
           <w:sz w:val="20"/>
           <w:szCs w:val="20"/>
         </w:rPr>
-        <w:t>findTopByOrderByIdDesc</w:t>
+        <w:t>findTopByOwnerIdOrderByIdDesc</w:t>
       </w:r>
       <w:r>
         <w:t xml:space="preserve">) - two bills at the exact same moment could collide; fine for one counter, not for many. Fix: DB sequence per year or </w:t>
@@ -15132,10 +15389,10 @@
           <w:b/>
           <w:bCs/>
         </w:rPr>
-        <w:t>Shard by shop_id</w:t>
-      </w:r>
-      <w:r>
-        <w:t xml:space="preserve"> once multi-tenant (today the app is single-shop - the biggest structural limit for real scale).</w:t>
+        <w:t>Shard by owner_id</w:t>
+      </w:r>
+      <w:r>
+        <w:t xml:space="preserve"> when one database struggles - tenancy is already row-level (owner_id on every shop-scoped table), so moving a shop's rows to its own shard is mechanical, not a redesign.</w:t>
       </w:r>
     </w:p>
     <w:p>
@@ -15296,10 +15553,10 @@
           <w:sz w:val="20"/>
           <w:szCs w:val="20"/>
         </w:rPr>
-        <w:t>shop_id</w:t>
-      </w:r>
-      <w:r>
-        <w:t xml:space="preserve"> on every table from commit one - retrofitting is painful.</w:t>
+        <w:t>owner_id</w:t>
+      </w:r>
+      <w:r>
+        <w:t xml:space="preserve"> from commit one - I added it mid-project and it worked, but touching every repository query is exactly the pain I would design out up front.</w:t>
       </w:r>
     </w:p>
     <w:p>
@@ -15347,7 +15604,7 @@
           <w:b/>
           <w:bCs/>
         </w:rPr>
-        <w:t>132 questions</w:t>
+        <w:t>140 questions</w:t>
       </w:r>
       <w:r>
         <w:t xml:space="preserve"> with sample answers, follow-ups and Remember tips. Answers are written in </w:t>
@@ -15475,7 +15732,7 @@
         <w:t>H2/MySQL</w:t>
       </w:r>
       <w:r>
-        <w:t xml:space="preserve"> database. Frontend is </w:t>
+        <w:t xml:space="preserve"> database, every query scoped by owner_id. Frontend is </w:t>
       </w:r>
       <w:r>
         <w:rPr>
@@ -15495,7 +15752,7 @@
         <w:t>FEFO stock deduction all in one transaction</w:t>
       </w:r>
       <w:r>
-        <w:t>, covered by 25 tests and a 59-check smoke script.</w:t>
+        <w:t>, covered by 34 tests and a 62-check smoke script.</w:t>
       </w:r>
     </w:p>
     <w:p>
@@ -16079,7 +16336,7 @@
         <w:t>two to three weeks</w:t>
       </w:r>
       <w:r>
-        <w:t xml:space="preserve"> of focused daily work, built feature by feature in 12 commits: skeleton and auth first, then CRUD, purchases and stock, billing and PDF, seed and smoke tests, frontend, tests, docs, and finally a UI redesign. PLAN.md tracks that order and each step has verification proof in PROGRESS.md.</w:t>
+        <w:t xml:space="preserve"> of focused daily work, built feature by feature in 25 commits: skeleton and auth first, then CRUD, purchases and stock, billing and PDF, seed and smoke tests, frontend, tests, docs, a UI redesign, an offline demo mode, and finally the multi-tenant refactor. PLAN.md tracks that order and each step has verification proof in PROGRESS.md.</w:t>
       </w:r>
     </w:p>
     <w:p>
@@ -16113,7 +16370,7 @@
         <w:t xml:space="preserve">Remember: </w:t>
       </w:r>
       <w:r>
-        <w:t>Cite the artifacts (PLAN.md, 12 commits) - dates are fuzzy, evidence is not.</w:t>
+        <w:t>Cite the artifacts (PLAN.md, 25 commits) - dates are fuzzy, evidence is not.</w:t>
       </w:r>
     </w:p>
     <w:p>
@@ -16265,19 +16522,7 @@
         <w:t xml:space="preserve">Answer: </w:t>
       </w:r>
       <w:r>
-        <w:t xml:space="preserve">Short term: refresh tokens, gap-free invoice numbering, and SQL-based reports with indexes. Medium term: payments and credit (baki khata), returns, IGST for inter-state sales, and an audit trail. Then Docker, CI/CD and multi-tenant </w:t>
-      </w:r>
-      <w:r>
-        <w:rPr>
-          <w:rFonts w:ascii="Consolas" w:eastAsia="Consolas" w:hAnsi="Consolas" w:cs="Consolas"/>
-          <w:color w:val="B03A2E"/>
-          <w:sz w:val="20"/>
-          <w:szCs w:val="20"/>
-        </w:rPr>
-        <w:t>shop_id</w:t>
-      </w:r>
-      <w:r>
-        <w:t xml:space="preserve"> so one deployment can serve many shops.</w:t>
+        <w:t xml:space="preserve">Short term: refresh tokens, gap-free invoice numbering, and SQL-based reports with indexes. Medium term: payments and credit (baki khata), returns, IGST for inter-state sales, and an audit trail. The multi-tenant refactor I have since built - one deployment now serves many isolated shops - while Docker and CI/CD are still missing.</w:t>
       </w:r>
     </w:p>
     <w:p>
@@ -16601,7 +16846,7 @@
         <w:t xml:space="preserve">Remember: </w:t>
       </w:r>
       <w:r>
-        <w:t>Clean = remove target, package = build jar; test phase runs the 25 tests.</w:t>
+        <w:t>Clean = remove target, package = build jar; test phase runs the 34 tests.</w:t>
       </w:r>
     </w:p>
     <w:p>
@@ -18715,7 +18960,7 @@
           <w:sz w:val="20"/>
           <w:szCs w:val="20"/>
         </w:rPr>
-        <w:t>findTopByOrderByIdDesc</w:t>
+        <w:t>findTopByOwnerIdOrderByIdDesc</w:t>
       </w:r>
       <w:r>
         <w:t xml:space="preserve">), parses </w:t>
@@ -19194,7 +19439,7 @@
         <w:t>Bearer &lt;token&gt;</w:t>
       </w:r>
       <w:r>
-        <w:t xml:space="preserve"> from localStorage; a </w:t>
+        <w:t xml:space="preserve"> from localStorage (skipped when the call sets config.anonymous - the register call does, so a lingering owner token cannot turn sign-up into a 403); a </w:t>
       </w:r>
       <w:r>
         <w:rPr>
@@ -21770,7 +22015,7 @@
         <w:t>invoice_item</w:t>
       </w:r>
       <w:r>
-        <w:t xml:space="preserve"> (FKs invoice/product/stock_batch). Money columns are </w:t>
+        <w:t xml:space="preserve"> (FKs invoice/product/stock_batch). Every shop-scoped table also carries owner_id - the owning shop's user id. Money columns are </w:t>
       </w:r>
       <w:r>
         <w:rPr>
@@ -22540,16 +22785,37 @@
         <w:t xml:space="preserve">Answer: </w:t>
       </w:r>
       <w:r>
-        <w:t xml:space="preserve">DB-level: </w:t>
-      </w:r>
-      <w:r>
-        <w:rPr>
-          <w:rFonts w:ascii="Consolas" w:eastAsia="Consolas" w:hAnsi="Consolas" w:cs="Consolas"/>
-          <w:color w:val="B03A2E"/>
-          <w:sz w:val="20"/>
-          <w:szCs w:val="20"/>
-        </w:rPr>
-        <w:t>users.email</w:t>
+        <w:rPr>
+          <w:rFonts w:ascii="Consolas" w:eastAsia="Consolas" w:hAnsi="Consolas" w:cs="Consolas"/>
+          <w:color w:val="B03A2E"/>
+          <w:sz w:val="20"/>
+          <w:szCs w:val="20"/>
+        </w:rPr>
+        <w:t xml:space="preserve">users.email</w:t>
+      </w:r>
+      <w:r>
+        <w:t xml:space="preserve"> is globally unique in the DB (</w:t>
+      </w:r>
+      <w:r>
+        <w:rPr>
+          <w:rFonts w:ascii="Consolas" w:eastAsia="Consolas" w:hAnsi="Consolas" w:cs="Consolas"/>
+          <w:color w:val="B03A2E"/>
+          <w:sz w:val="20"/>
+          <w:szCs w:val="20"/>
+        </w:rPr>
+        <w:t xml:space="preserve">@Column(unique = true)</w:t>
+      </w:r>
+      <w:r>
+        <w:t xml:space="preserve">) - duplicates surface as DuplicateKeyException -&gt; 409 from my advice. The shop-scoped ones are per-tenant: category.name, barcode and invoice numbers are checked only inside the caller's own rows (</w:t>
+      </w:r>
+      <w:r>
+        <w:rPr>
+          <w:rFonts w:ascii="Consolas" w:eastAsia="Consolas" w:hAnsi="Consolas" w:cs="Consolas"/>
+          <w:color w:val="B03A2E"/>
+          <w:sz w:val="20"/>
+          <w:szCs w:val="20"/>
+        </w:rPr>
+        <w:t xml:space="preserve">existsByOwnerIdAndName</w:t>
       </w:r>
       <w:r>
         <w:t xml:space="preserve">, </w:t>
@@ -22561,7 +22827,7 @@
           <w:sz w:val="20"/>
           <w:szCs w:val="20"/>
         </w:rPr>
-        <w:t>category.name</w:t>
+        <w:t xml:space="preserve">existsByOwnerIdAndBarcode</w:t>
       </w:r>
       <w:r>
         <w:t xml:space="preserve">, </w:t>
@@ -22573,70 +22839,10 @@
           <w:sz w:val="20"/>
           <w:szCs w:val="20"/>
         </w:rPr>
-        <w:t>invoice.invoice_number</w:t>
-      </w:r>
-      <w:r>
-        <w:t xml:space="preserve"> via </w:t>
-      </w:r>
-      <w:r>
-        <w:rPr>
-          <w:rFonts w:ascii="Consolas" w:eastAsia="Consolas" w:hAnsi="Consolas" w:cs="Consolas"/>
-          <w:color w:val="B03A2E"/>
-          <w:sz w:val="20"/>
-          <w:szCs w:val="20"/>
-        </w:rPr>
-        <w:t>@Column(unique = true)</w:t>
-      </w:r>
-      <w:r>
-        <w:t xml:space="preserve"> - duplicates surface as </w:t>
-      </w:r>
-      <w:r>
-        <w:rPr>
-          <w:rFonts w:ascii="Consolas" w:eastAsia="Consolas" w:hAnsi="Consolas" w:cs="Consolas"/>
-          <w:color w:val="B03A2E"/>
-          <w:sz w:val="20"/>
-          <w:szCs w:val="20"/>
-        </w:rPr>
-        <w:t>DuplicateKeyException</w:t>
-      </w:r>
-      <w:r>
-        <w:t xml:space="preserve"> -&gt; 409 from my advice. Application-level: barcode uniqueness is checked in </w:t>
-      </w:r>
-      <w:r>
-        <w:rPr>
-          <w:rFonts w:ascii="Consolas" w:eastAsia="Consolas" w:hAnsi="Consolas" w:cs="Consolas"/>
-          <w:color w:val="B03A2E"/>
-          <w:sz w:val="20"/>
-          <w:szCs w:val="20"/>
-        </w:rPr>
-        <w:t>ProductService</w:t>
-      </w:r>
-      <w:r>
-        <w:t xml:space="preserve"> with </w:t>
-      </w:r>
-      <w:r>
-        <w:rPr>
-          <w:rFonts w:ascii="Consolas" w:eastAsia="Consolas" w:hAnsi="Consolas" w:cs="Consolas"/>
-          <w:color w:val="B03A2E"/>
-          <w:sz w:val="20"/>
-          <w:szCs w:val="20"/>
-        </w:rPr>
-        <w:t>existsByBarcode</w:t>
-      </w:r>
-      <w:r>
-        <w:t xml:space="preserve"> / </w:t>
-      </w:r>
-      <w:r>
-        <w:rPr>
-          <w:rFonts w:ascii="Consolas" w:eastAsia="Consolas" w:hAnsi="Consolas" w:cs="Consolas"/>
-          <w:color w:val="B03A2E"/>
-          <w:sz w:val="20"/>
-          <w:szCs w:val="20"/>
-        </w:rPr>
-        <w:t>existsByBarcodeAndIdNot</w:t>
-      </w:r>
-      <w:r>
-        <w:t xml:space="preserve"> so the error message names the field.</w:t>
+        <w:t xml:space="preserve">findTopByOwnerIdOrderByIdDesc</w:t>
+      </w:r>
+      <w:r>
+        <w:t xml:space="preserve">), so two shops may reuse the same names and numbers while a second one inside the same shop is still 409.</w:t>
       </w:r>
     </w:p>
     <w:p>
@@ -22950,7 +23156,7 @@
         <w:t>invoice_item(invoice_id)</w:t>
       </w:r>
       <w:r>
-        <w:t xml:space="preserve">, FK columns; then </w:t>
+        <w:t xml:space="preserve">, owner_id composites for tenant scans, FK columns; then </w:t>
       </w:r>
       <w:r>
         <w:rPr>
@@ -23050,7 +23256,7 @@
         <w:t xml:space="preserve">Answer: </w:t>
       </w:r>
       <w:r>
-        <w:t xml:space="preserve">About 31 endpoints under </w:t>
+        <w:t xml:space="preserve">About 28 endpoints under </w:t>
       </w:r>
       <w:r>
         <w:rPr>
@@ -23072,7 +23278,7 @@
         <w:t>auth</w:t>
       </w:r>
       <w:r>
-        <w:t xml:space="preserve"> register/login; </w:t>
+        <w:t xml:space="preserve"> register/login (both permitAll); </w:t>
       </w:r>
       <w:r>
         <w:rPr>
@@ -24543,7 +24749,7 @@
           <w:sz w:val="20"/>
           <w:szCs w:val="20"/>
         </w:rPr>
-        <w:t>App.jsx</w:t>
+        <w:t xml:space="preserve">App.jsx</w:t>
       </w:r>
       <w:r>
         <w:t xml:space="preserve"> defines routes: </w:t>
@@ -24555,7 +24761,19 @@
           <w:sz w:val="20"/>
           <w:szCs w:val="20"/>
         </w:rPr>
-        <w:t>/login</w:t>
+        <w:t xml:space="preserve">/login</w:t>
+      </w:r>
+      <w:r>
+        <w:t xml:space="preserve"> and </w:t>
+      </w:r>
+      <w:r>
+        <w:rPr>
+          <w:rFonts w:ascii="Consolas" w:eastAsia="Consolas" w:hAnsi="Consolas" w:cs="Consolas"/>
+          <w:color w:val="B03A2E"/>
+          <w:sz w:val="20"/>
+          <w:szCs w:val="20"/>
+        </w:rPr>
+        <w:t xml:space="preserve">/register</w:t>
       </w:r>
       <w:r>
         <w:t xml:space="preserve"> public, everything else inside </w:t>
@@ -24567,7 +24785,7 @@
           <w:sz w:val="20"/>
           <w:szCs w:val="20"/>
         </w:rPr>
-        <w:t>ProtectedRoute</w:t>
+        <w:t xml:space="preserve">ProtectedRoute</w:t>
       </w:r>
       <w:r>
         <w:t xml:space="preserve"> -&gt; </w:t>
@@ -24579,31 +24797,31 @@
           <w:sz w:val="20"/>
           <w:szCs w:val="20"/>
         </w:rPr>
-        <w:t>Layout</w:t>
-      </w:r>
-      <w:r>
-        <w:t xml:space="preserve"> (Sidebar + Navbar + page outlet). Ten pages live in </w:t>
-      </w:r>
-      <w:r>
-        <w:rPr>
-          <w:rFonts w:ascii="Consolas" w:eastAsia="Consolas" w:hAnsi="Consolas" w:cs="Consolas"/>
-          <w:color w:val="B03A2E"/>
-          <w:sz w:val="20"/>
-          <w:szCs w:val="20"/>
-        </w:rPr>
-        <w:t>pages/</w:t>
-      </w:r>
-      <w:r>
-        <w:t xml:space="preserve"> (Login, Dashboard, Billing, Products, Categories, Suppliers, PurchaseNew, Stock, Invoices, Reports); shared UI in </w:t>
-      </w:r>
-      <w:r>
-        <w:rPr>
-          <w:rFonts w:ascii="Consolas" w:eastAsia="Consolas" w:hAnsi="Consolas" w:cs="Consolas"/>
-          <w:color w:val="B03A2E"/>
-          <w:sz w:val="20"/>
-          <w:szCs w:val="20"/>
-        </w:rPr>
-        <w:t>components/</w:t>
+        <w:t xml:space="preserve">Layout</w:t>
+      </w:r>
+      <w:r>
+        <w:t xml:space="preserve"> (Sidebar + Navbar + page outlet). Twelve pages live in </w:t>
+      </w:r>
+      <w:r>
+        <w:rPr>
+          <w:rFonts w:ascii="Consolas" w:eastAsia="Consolas" w:hAnsi="Consolas" w:cs="Consolas"/>
+          <w:color w:val="B03A2E"/>
+          <w:sz w:val="20"/>
+          <w:szCs w:val="20"/>
+        </w:rPr>
+        <w:t xml:space="preserve">pages/</w:t>
+      </w:r>
+      <w:r>
+        <w:t xml:space="preserve"> (Login, Register, Dashboard, Billing, Products, Categories, Suppliers, PurchaseNew, Stock, Invoices, Reports, Users); shared UI in </w:t>
+      </w:r>
+      <w:r>
+        <w:rPr>
+          <w:rFonts w:ascii="Consolas" w:eastAsia="Consolas" w:hAnsi="Consolas" w:cs="Consolas"/>
+          <w:color w:val="B03A2E"/>
+          <w:sz w:val="20"/>
+          <w:szCs w:val="20"/>
+        </w:rPr>
+        <w:t xml:space="preserve">components/</w:t>
       </w:r>
       <w:r>
         <w:t xml:space="preserve"> (Modal via portal, Loader, StatCard, Pagination); API in </w:t>
@@ -24615,7 +24833,7 @@
           <w:sz w:val="20"/>
           <w:szCs w:val="20"/>
         </w:rPr>
-        <w:t>api/axios.js</w:t>
+        <w:t xml:space="preserve">api/axios.js</w:t>
       </w:r>
       <w:r>
         <w:t xml:space="preserve">; auth state in </w:t>
@@ -24627,10 +24845,10 @@
           <w:sz w:val="20"/>
           <w:szCs w:val="20"/>
         </w:rPr>
-        <w:t>context/AuthContext.jsx</w:t>
-      </w:r>
-      <w:r>
-        <w:t>.</w:t>
+        <w:t xml:space="preserve">context/AuthContext.jsx</w:t>
+      </w:r>
+      <w:r>
+        <w:t xml:space="preserve">. If the backend is unreachable, the Axios interceptor serves a mock dataset instead - an offline demo mode flagged by a navbar badge.</w:t>
       </w:r>
     </w:p>
     <w:p>
@@ -25471,7 +25689,7 @@
         <w:t>Recharts and React are separate cached chunks</w:t>
       </w:r>
       <w:r>
-        <w:t xml:space="preserve"> - main app code is ~148 kB, React ~164 kB, Recharts ~384 kB (gzip 41/53/106 kB). Routes could be lazy-loaded next.</w:t>
+        <w:t xml:space="preserve"> - main app code is ~175 kB, React ~164 kB, Recharts ~384 kB (gzip 49/53/106 kB). Routes could be lazy-loaded next.</w:t>
       </w:r>
     </w:p>
     <w:p>
@@ -26632,53 +26850,19 @@
         <w:t xml:space="preserve">Answer: </w:t>
       </w:r>
       <w:r>
-        <w:t xml:space="preserve">Two guards in </w:t>
-      </w:r>
-      <w:r>
-        <w:rPr>
-          <w:rFonts w:ascii="Consolas" w:eastAsia="Consolas" w:hAnsi="Consolas" w:cs="Consolas"/>
-          <w:color w:val="B03A2E"/>
-          <w:sz w:val="20"/>
-          <w:szCs w:val="20"/>
-        </w:rPr>
-        <w:t>AuthService.register()</w:t>
-      </w:r>
-      <w:r>
-        <w:t xml:space="preserve">: first, when the user table is empty, anyone may register - that creates the </w:t>
-      </w:r>
-      <w:r>
-        <w:rPr>
-          <w:b/>
-          <w:bCs/>
-        </w:rPr>
-        <w:t>bootstrap owner</w:t>
-      </w:r>
-      <w:r>
-        <w:t>; afterwards only an authenticated OWNER can create users (403 otherwise). Second, the requested role is validated (</w:t>
-      </w:r>
-      <w:r>
-        <w:rPr>
-          <w:rFonts w:ascii="Consolas" w:eastAsia="Consolas" w:hAnsi="Consolas" w:cs="Consolas"/>
-          <w:color w:val="B03A2E"/>
-          <w:sz w:val="20"/>
-          <w:szCs w:val="20"/>
-        </w:rPr>
-        <w:t>OWNER</w:t>
-      </w:r>
-      <w:r>
-        <w:t xml:space="preserve"> or </w:t>
-      </w:r>
-      <w:r>
-        <w:rPr>
-          <w:rFonts w:ascii="Consolas" w:eastAsia="Consolas" w:hAnsi="Consolas" w:cs="Consolas"/>
-          <w:color w:val="B03A2E"/>
-          <w:sz w:val="20"/>
-          <w:szCs w:val="20"/>
-        </w:rPr>
-        <w:t>STAFF</w:t>
-      </w:r>
-      <w:r>
-        <w:t xml:space="preserve"> only). So no anonymous user can ever mint an OWNER after bootstrap.</w:t>
+        <w:t xml:space="preserve">Three modes in </w:t>
+      </w:r>
+      <w:r>
+        <w:rPr>
+          <w:rFonts w:ascii="Consolas" w:eastAsia="Consolas" w:hAnsi="Consolas" w:cs="Consolas"/>
+          <w:color w:val="B03A2E"/>
+          <w:sz w:val="20"/>
+          <w:szCs w:val="20"/>
+        </w:rPr>
+        <w:t xml:space="preserve">AuthService.register()</w:t>
+      </w:r>
+      <w:r>
+        <w:t xml:space="preserve">: an anonymous caller may register only as OWNER - that starts a brand new shop (the old first-user-bootstrap rule is gone); an OWNER token may register only STAFF, and the new row gets that owner's owner_id; a STAFF token always gets 403. Duplicate email is 409, an unknown role string is 400. Nothing lets anyone write into an existing shop they do not own.</w:t>
       </w:r>
     </w:p>
     <w:p>
@@ -26695,7 +26879,7 @@
         <w:t xml:space="preserve">Follow-up: </w:t>
       </w:r>
       <w:r>
-        <w:t>Can a STAFF create an owner?</w:t>
+        <w:t>Can an anonymous user or a STAFF create users?</w:t>
       </w:r>
     </w:p>
     <w:p>
@@ -26712,19 +26896,7 @@
         <w:t xml:space="preserve">Remember: </w:t>
       </w:r>
       <w:r>
-        <w:t xml:space="preserve">No - STAFF is not OWNER, the </w:t>
-      </w:r>
-      <w:r>
-        <w:rPr>
-          <w:rFonts w:ascii="Consolas" w:eastAsia="Consolas" w:hAnsi="Consolas" w:cs="Consolas"/>
-          <w:color w:val="B03A2E"/>
-          <w:sz w:val="20"/>
-          <w:szCs w:val="20"/>
-        </w:rPr>
-        <w:t>isOwner</w:t>
-      </w:r>
-      <w:r>
-        <w:t xml:space="preserve"> check fails with 403.</w:t>
+        <w:t xml:space="preserve">Both get 403: a STAFF token is never the owner, and anonymous registration with role STAFF is refused with "Register as an owner to start a new shop".</w:t>
       </w:r>
     </w:p>
     <w:p>
@@ -26930,7 +27102,7 @@
         <w:t>AuthControllerTest</w:t>
       </w:r>
       <w:r>
-        <w:t xml:space="preserve"> covers registration bootstrap and wrong-password 401; the smoke script asserts 401/403 and that expired stock cannot be sold. I have </w:t>
+        <w:t xml:space="preserve"> covers the five register rules and wrong-password 401; TenantIsolationTest proves two owners cannot read each other's data (cross-tenant 404s, per-shop category names, scoped reports); the smoke script asserts 401/403 and that expired stock cannot be sold. I have </w:t>
       </w:r>
       <w:r>
         <w:rPr>
@@ -27035,22 +27207,34 @@
           <w:b/>
           <w:bCs/>
         </w:rPr>
-        <w:t>stateless JWT</w:t>
-      </w:r>
-      <w:r>
-        <w:t xml:space="preserve"> means I can run N identical jar instances behind a load balancer with no session affinity. Then: MySQL with the indexes I listed, read replicas for reports, Redis for hot product search and dashboard summary, PDF generation moved to a queue, frontend on a CDN, and rate limiting at the edge. Multi-tenant </w:t>
-      </w:r>
-      <w:r>
-        <w:rPr>
-          <w:rFonts w:ascii="Consolas" w:eastAsia="Consolas" w:hAnsi="Consolas" w:cs="Consolas"/>
-          <w:color w:val="B03A2E"/>
-          <w:sz w:val="20"/>
-          <w:szCs w:val="20"/>
-        </w:rPr>
-        <w:t>shop_id</w:t>
-      </w:r>
-      <w:r>
-        <w:t xml:space="preserve"> sharding is the structural prerequisite.</w:t>
+        <w:t xml:space="preserve">stateless JWT</w:t>
+      </w:r>
+      <w:r>
+        <w:t xml:space="preserve"> means I can run N identical jar instances behind a load balancer with no session affinity. Then: MySQL with the indexes I listed, read replicas for reports, Redis for hot product search and dashboard summary, PDF generation moved to a queue, frontend on a CDN, and rate limiting at the edge. Multi-tenancy already exists - </w:t>
+      </w:r>
+      <w:r>
+        <w:rPr>
+          <w:rFonts w:ascii="Consolas" w:eastAsia="Consolas" w:hAnsi="Consolas" w:cs="Consolas"/>
+          <w:color w:val="B03A2E"/>
+          <w:sz w:val="20"/>
+          <w:szCs w:val="20"/>
+        </w:rPr>
+        <w:t xml:space="preserve">owner_id</w:t>
+      </w:r>
+      <w:r>
+        <w:t xml:space="preserve"> on every shop-scoped table - so sharding by </w:t>
+      </w:r>
+      <w:r>
+        <w:rPr>
+          <w:rFonts w:ascii="Consolas" w:eastAsia="Consolas" w:hAnsi="Consolas" w:cs="Consolas"/>
+          <w:color w:val="B03A2E"/>
+          <w:sz w:val="20"/>
+          <w:szCs w:val="20"/>
+        </w:rPr>
+        <w:t xml:space="preserve">owner_id</w:t>
+      </w:r>
+      <w:r>
+        <w:t xml:space="preserve"> is a data move, not a redesign.</w:t>
       </w:r>
     </w:p>
     <w:p>
@@ -27795,7 +27979,7 @@
         <w:t>React</w:t>
       </w:r>
       <w:r>
-        <w:t xml:space="preserve"> into cached vendor chunks (visible in the build output), pages fetch only what they render, and tables paginate. Not done: route-level lazy imports, image optimization (few images anyway), and virtualized long lists. Bundle is ~148 kB main + vendors - healthy for this app.</w:t>
+        <w:t xml:space="preserve"> into cached vendor chunks (visible in the build output), pages fetch only what they render, and tables paginate. Not done: route-level lazy imports, image optimization (few images anyway), and virtualized long lists. Bundle is ~175 kB main + vendors - healthy for this app.</w:t>
       </w:r>
     </w:p>
     <w:p>
@@ -28308,7 +28492,7 @@
         <w:t>backend/data</w:t>
       </w:r>
       <w:r>
-        <w:t>, restart). After that: all 59 checks green. Lesson: test fixtures must be explicit about their starting state.</w:t>
+        <w:t>, restart). After that: all 62 checks green. Lesson: test fixtures must be explicit about their starting state.</w:t>
       </w:r>
     </w:p>
     <w:p>
@@ -28507,7 +28691,7 @@
         <w:t>`nextInvoiceNumber()` reading the last invoice to increment</w:t>
       </w:r>
       <w:r>
-        <w:t xml:space="preserve"> - elegant for one counter, racy for many. I knew the trade-off when writing it (documented in README limitations), chose the simple version for a single-shop scope, and I would replace it with a yearly sequence row locked with </w:t>
+        <w:t xml:space="preserve"> - elegant for one counter, racy for many. I knew the trade-off when writing it (documented in README limitations), chose the simple version per shop - isolation by owner_id landed later, but two staff billing simultaneously in the same shop can still collide - and I would replace it with a yearly sequence row locked with </w:t>
       </w:r>
       <w:r>
         <w:rPr>
@@ -28604,7 +28788,7 @@
           <w:b/>
           <w:bCs/>
         </w:rPr>
-        <w:t>Docker and a CI pipeline</w:t>
+        <w:t xml:space="preserve">Docker and a CI pipeline</w:t>
       </w:r>
       <w:r>
         <w:t xml:space="preserve"> from commit one (I added them last, i.e., not at all - CI is still missing); write </w:t>
@@ -28614,32 +28798,32 @@
           <w:b/>
           <w:bCs/>
         </w:rPr>
-        <w:t>tests alongside each feature</w:t>
-      </w:r>
-      <w:r>
-        <w:t xml:space="preserve"> instead of a dedicated test phase (less context switching, earlier feedback); and design for </w:t>
-      </w:r>
-      <w:r>
-        <w:rPr>
-          <w:b/>
-          <w:bCs/>
-        </w:rPr>
-        <w:t>multi-tenancy</w:t>
-      </w:r>
-      <w:r>
-        <w:t xml:space="preserve"> (</w:t>
-      </w:r>
-      <w:r>
-        <w:rPr>
-          <w:rFonts w:ascii="Consolas" w:eastAsia="Consolas" w:hAnsi="Consolas" w:cs="Consolas"/>
-          <w:color w:val="B03A2E"/>
-          <w:sz w:val="20"/>
-          <w:szCs w:val="20"/>
-        </w:rPr>
-        <w:t>shop_id</w:t>
-      </w:r>
-      <w:r>
-        <w:t>) from the schema, because retrofitting it touches every query.</w:t>
+        <w:t xml:space="preserve">tests alongside each feature</w:t>
+      </w:r>
+      <w:r>
+        <w:t xml:space="preserve"> instead of a dedicated test phase (less context switching, earlier feedback); and design </w:t>
+      </w:r>
+      <w:r>
+        <w:rPr>
+          <w:b/>
+          <w:bCs/>
+        </w:rPr>
+        <w:t xml:space="preserve">multi-tenancy</w:t>
+      </w:r>
+      <w:r>
+        <w:t xml:space="preserve"> into the schema from commit one - I actually retrofitted it mid-project (</w:t>
+      </w:r>
+      <w:r>
+        <w:rPr>
+          <w:rFonts w:ascii="Consolas" w:eastAsia="Consolas" w:hAnsi="Consolas" w:cs="Consolas"/>
+          <w:color w:val="B03A2E"/>
+          <w:sz w:val="20"/>
+          <w:szCs w:val="20"/>
+        </w:rPr>
+        <w:t xml:space="preserve">owner_id</w:t>
+      </w:r>
+      <w:r>
+        <w:t xml:space="preserve"> across six tables, every query tenant-scoped), which worked but proved exactly why it belongs up front.</w:t>
       </w:r>
     </w:p>
     <w:p>
@@ -28729,7 +28913,7 @@
         <w:t>mvn clean test</w:t>
       </w:r>
       <w:r>
-        <w:t xml:space="preserve"> (25 automated tests) for logic; </w:t>
+        <w:t xml:space="preserve"> (34 automated tests) for logic; </w:t>
       </w:r>
       <w:r>
         <w:rPr>
@@ -28741,7 +28925,7 @@
         <w:t>scripts/smoke-test.ps1</w:t>
       </w:r>
       <w:r>
-        <w:t xml:space="preserve"> (59 checks) against the running server for real HTTP behavior - FEFO order, exact GST amounts, rollback, role rules, PDF bytes; and manual browser verification with screenshots for the frontend, including the modal fix. PLAN.md required a green verification after every step.</w:t>
+        <w:t xml:space="preserve"> (62 checks) against the running server for real HTTP behavior - FEFO order, exact GST amounts, rollback, role rules, PDF bytes; and manual browser verification with screenshots for the frontend, including the modal fix. PLAN.md required a green verification after every step.</w:t>
       </w:r>
     </w:p>
     <w:p>
@@ -29368,7 +29552,7 @@
         <w:t xml:space="preserve">Answer: </w:t>
       </w:r>
       <w:r>
-        <w:t xml:space="preserve">I defined quality as checks I can run: 25 unit/MockMvc tests for logic, a 59-check smoke script for real HTTP flows (including failure cases like insufficient stock and expired batches), a green </w:t>
+        <w:t xml:space="preserve">I defined quality as checks I can run: 34 unit/MockMvc tests for logic, a 62-check smoke script for real HTTP flows (including failure cases like insufficient stock and expired batches), a green </w:t>
       </w:r>
       <w:r>
         <w:rPr>
@@ -29536,7 +29720,7 @@
         <w:t xml:space="preserve">Answer: </w:t>
       </w:r>
       <w:r>
-        <w:t>Every nice idea went to a 'next phase' list instead of the active plan - payments, returns, multi-tenant, React tests are all recorded in limitations. When I redesigned the UI, it was a bounded commit after the core was green, not a mid-feature rewrite. Writing the scope down is what stops a solo developer from endlessly polishing.</w:t>
+        <w:t>Every nice idea went to a 'next phase' list instead of the active plan - payments, returns and React tests are all recorded in limitations - multi-tenancy I later promoted from that list into the active plan. When I redesigned the UI, it was a bounded commit after the core was green, not a mid-feature rewrite. Writing the scope down is what stops a solo developer from endlessly polishing.</w:t>
       </w:r>
     </w:p>
     <w:p>
@@ -31571,6 +31755,797 @@
     </w:p>
     <w:p>
       <w:pPr>
+        <w:pStyle w:val="Heading2"/>
+      </w:pPr>
+      <w:r>
+        <w:t xml:space="preserve">n) Multi-tenancy and shop isolation</w:t>
+      </w:r>
+    </w:p>
+    <w:p>
+      <w:pPr>
+        <w:keepNext/>
+        <w:pBdr>
+          <w:left w:val="single" w:sz="14" w:space="6" w:color="0F886D"/>
+        </w:pBdr>
+        <w:shd w:val="clear" w:color="auto" w:fill="F8FAFC"/>
+        <w:spacing w:before="200" w:after="70"/>
+        <w:ind w:left="80"/>
+      </w:pPr>
+      <w:r>
+        <w:rPr>
+          <w:b/>
+          <w:bCs/>
+          <w:color w:val="0F886D"/>
+        </w:rPr>
+        <w:t xml:space="preserve">Q133. </w:t>
+      </w:r>
+      <w:r>
+        <w:rPr>
+          <w:b/>
+          <w:bCs/>
+          <w:color w:val="0A1424"/>
+        </w:rPr>
+        <w:t xml:space="preserve">You call this multi-tenant - what does that actually mean in the code?</w:t>
+      </w:r>
+    </w:p>
+    <w:p>
+      <w:pPr>
+        <w:spacing w:after="50" w:line="264" w:lineRule="auto"/>
+        <w:ind w:left="80"/>
+      </w:pPr>
+      <w:r>
+        <w:rPr>
+          <w:b/>
+          <w:bCs/>
+          <w:color w:val="0F886D"/>
+        </w:rPr>
+        <w:t xml:space="preserve">Answer: </w:t>
+      </w:r>
+      <w:r>
+        <w:t xml:space="preserve">Every shop-scoped table carries an </w:t>
+      </w:r>
+      <w:r>
+        <w:rPr>
+          <w:rFonts w:ascii="Consolas" w:eastAsia="Consolas" w:hAnsi="Consolas" w:cs="Consolas"/>
+          <w:color w:val="B03A2E"/>
+          <w:sz w:val="20"/>
+          <w:szCs w:val="20"/>
+        </w:rPr>
+        <w:t xml:space="preserve">owner_id</w:t>
+      </w:r>
+      <w:r>
+        <w:t xml:space="preserve"> column (users, category, product, supplier, purchase, invoice). A tenant is one owner: an OWNER's shop id IS their own user id, and every STAFF row stores the owner's id. Services read the caller's tenant with </w:t>
+      </w:r>
+      <w:r>
+        <w:rPr>
+          <w:rFonts w:ascii="Consolas" w:eastAsia="Consolas" w:hAnsi="Consolas" w:cs="Consolas"/>
+          <w:color w:val="B03A2E"/>
+          <w:sz w:val="20"/>
+          <w:szCs w:val="20"/>
+        </w:rPr>
+        <w:t xml:space="preserve">CurrentTenant.id()</w:t>
+      </w:r>
+      <w:r>
+        <w:t xml:space="preserve"> and pass it into every repository query, so isolation lives in the data layer - not in UI hiding.</w:t>
+      </w:r>
+    </w:p>
+    <w:p>
+      <w:pPr>
+        <w:spacing w:after="50" w:line="264" w:lineRule="auto"/>
+        <w:ind w:left="80"/>
+      </w:pPr>
+      <w:r>
+        <w:rPr>
+          <w:b/>
+          <w:bCs/>
+          <w:color w:val="D47E10"/>
+        </w:rPr>
+        <w:t xml:space="preserve">Follow-up: </w:t>
+      </w:r>
+      <w:r>
+        <w:t xml:space="preserve">Why owner id instead of a separate shop table?</w:t>
+      </w:r>
+    </w:p>
+    <w:p>
+      <w:pPr>
+        <w:shd w:val="clear" w:color="auto" w:fill="EEF2FF"/>
+        <w:ind w:left="80"/>
+      </w:pPr>
+      <w:r>
+        <w:rPr>
+          <w:b/>
+          <w:bCs/>
+          <w:color w:val="4F5BD5"/>
+        </w:rPr>
+        <w:t xml:space="preserve">Remember: </w:t>
+      </w:r>
+      <w:r>
+        <w:t xml:space="preserve">The owner user row IS the shop - one less join, one source of truth; staff simply reference it.</w:t>
+      </w:r>
+    </w:p>
+    <w:p>
+      <w:pPr>
+        <w:keepNext/>
+        <w:pBdr>
+          <w:left w:val="single" w:sz="14" w:space="6" w:color="0F886D"/>
+        </w:pBdr>
+        <w:shd w:val="clear" w:color="auto" w:fill="F8FAFC"/>
+        <w:spacing w:before="200" w:after="70"/>
+        <w:ind w:left="80"/>
+      </w:pPr>
+      <w:r>
+        <w:rPr>
+          <w:b/>
+          <w:bCs/>
+          <w:color w:val="0F886D"/>
+        </w:rPr>
+        <w:t xml:space="preserve">Q134. </w:t>
+      </w:r>
+      <w:r>
+        <w:rPr>
+          <w:b/>
+          <w:bCs/>
+          <w:color w:val="0A1424"/>
+        </w:rPr>
+        <w:t xml:space="preserve">How does the server know which shop a request belongs to?</w:t>
+      </w:r>
+    </w:p>
+    <w:p>
+      <w:pPr>
+        <w:spacing w:after="50" w:line="264" w:lineRule="auto"/>
+        <w:ind w:left="80"/>
+      </w:pPr>
+      <w:r>
+        <w:rPr>
+          <w:b/>
+          <w:bCs/>
+          <w:color w:val="0F886D"/>
+        </w:rPr>
+        <w:t xml:space="preserve">Answer: </w:t>
+      </w:r>
+      <w:r>
+        <w:rPr>
+          <w:rFonts w:ascii="Consolas" w:eastAsia="Consolas" w:hAnsi="Consolas" w:cs="Consolas"/>
+          <w:color w:val="B03A2E"/>
+          <w:sz w:val="20"/>
+          <w:szCs w:val="20"/>
+        </w:rPr>
+        <w:t xml:space="preserve">UserDetailsServiceImpl</w:t>
+      </w:r>
+      <w:r>
+        <w:t xml:space="preserve"> builds </w:t>
+      </w:r>
+      <w:r>
+        <w:rPr>
+          <w:rFonts w:ascii="Consolas" w:eastAsia="Consolas" w:hAnsi="Consolas" w:cs="Consolas"/>
+          <w:color w:val="B03A2E"/>
+          <w:sz w:val="20"/>
+          <w:szCs w:val="20"/>
+        </w:rPr>
+        <w:t xml:space="preserve">AppUserDetails</w:t>
+      </w:r>
+      <w:r>
+        <w:t xml:space="preserve"> with tenantId = ownerId != null ? ownerId : id - the JWT names the user, the principal carries the tenant. </w:t>
+      </w:r>
+      <w:r>
+        <w:rPr>
+          <w:rFonts w:ascii="Consolas" w:eastAsia="Consolas" w:hAnsi="Consolas" w:cs="Consolas"/>
+          <w:color w:val="B03A2E"/>
+          <w:sz w:val="20"/>
+          <w:szCs w:val="20"/>
+        </w:rPr>
+        <w:t xml:space="preserve">CurrentTenant.id()</w:t>
+      </w:r>
+      <w:r>
+        <w:t xml:space="preserve"> reads it from the SecurityContext on every call and throws </w:t>
+      </w:r>
+      <w:r>
+        <w:rPr>
+          <w:rFonts w:ascii="Consolas" w:eastAsia="Consolas" w:hAnsi="Consolas" w:cs="Consolas"/>
+          <w:color w:val="B03A2E"/>
+          <w:sz w:val="20"/>
+          <w:szCs w:val="20"/>
+        </w:rPr>
+        <w:t xml:space="preserve">UnauthorizedException("Please login first")</w:t>
+      </w:r>
+      <w:r>
+        <w:t xml:space="preserve"> if anonymous. The tenant is derived from identity, never from a client-supplied header, so it cannot be spoofed.</w:t>
+      </w:r>
+    </w:p>
+    <w:p>
+      <w:pPr>
+        <w:spacing w:after="50" w:line="264" w:lineRule="auto"/>
+        <w:ind w:left="80"/>
+      </w:pPr>
+      <w:r>
+        <w:rPr>
+          <w:b/>
+          <w:bCs/>
+          <w:color w:val="D47E10"/>
+        </w:rPr>
+        <w:t xml:space="preserve">Follow-up: </w:t>
+      </w:r>
+      <w:r>
+        <w:t xml:space="preserve">Why not pass the shop id from the frontend?</w:t>
+      </w:r>
+    </w:p>
+    <w:p>
+      <w:pPr>
+        <w:shd w:val="clear" w:color="auto" w:fill="EEF2FF"/>
+        <w:ind w:left="80"/>
+      </w:pPr>
+      <w:r>
+        <w:rPr>
+          <w:b/>
+          <w:bCs/>
+          <w:color w:val="4F5BD5"/>
+        </w:rPr>
+        <w:t xml:space="preserve">Remember: </w:t>
+      </w:r>
+      <w:r>
+        <w:t xml:space="preserve">Identity-derived tenant - the frontend never chooses the shop, so tampering is impossible.</w:t>
+      </w:r>
+    </w:p>
+    <w:p>
+      <w:pPr>
+        <w:keepNext/>
+        <w:pBdr>
+          <w:left w:val="single" w:sz="14" w:space="6" w:color="0F886D"/>
+        </w:pBdr>
+        <w:shd w:val="clear" w:color="auto" w:fill="F8FAFC"/>
+        <w:spacing w:before="200" w:after="70"/>
+        <w:ind w:left="80"/>
+      </w:pPr>
+      <w:r>
+        <w:rPr>
+          <w:b/>
+          <w:bCs/>
+          <w:color w:val="0F886D"/>
+        </w:rPr>
+        <w:t xml:space="preserve">Q135. </w:t>
+      </w:r>
+      <w:r>
+        <w:rPr>
+          <w:b/>
+          <w:bCs/>
+          <w:color w:val="0A1424"/>
+        </w:rPr>
+        <w:t xml:space="preserve">What stops me from reading another shop's invoice by id?</w:t>
+      </w:r>
+    </w:p>
+    <w:p>
+      <w:pPr>
+        <w:spacing w:after="50" w:line="264" w:lineRule="auto"/>
+        <w:ind w:left="80"/>
+      </w:pPr>
+      <w:r>
+        <w:rPr>
+          <w:b/>
+          <w:bCs/>
+          <w:color w:val="0F886D"/>
+        </w:rPr>
+        <w:t xml:space="preserve">Answer: </w:t>
+      </w:r>
+      <w:r>
+        <w:t xml:space="preserve">The owner-scoped query. </w:t>
+      </w:r>
+      <w:r>
+        <w:rPr>
+          <w:rFonts w:ascii="Consolas" w:eastAsia="Consolas" w:hAnsi="Consolas" w:cs="Consolas"/>
+          <w:color w:val="B03A2E"/>
+          <w:sz w:val="20"/>
+          <w:szCs w:val="20"/>
+        </w:rPr>
+        <w:t xml:space="preserve">findByIdWithItems(id, CurrentTenant.id())</w:t>
+      </w:r>
+      <w:r>
+        <w:t xml:space="preserve"> loads invoice AND tenant together; a wrong-shop id comes back empty and the service answers 404 "Invoice not found with id 123" - byte-identical to a genuinely missing row, so enumeration leaks nothing. CategoryService does the same with an explicit owner check after load.</w:t>
+      </w:r>
+    </w:p>
+    <w:p>
+      <w:pPr>
+        <w:spacing w:after="50" w:line="264" w:lineRule="auto"/>
+        <w:ind w:left="80"/>
+      </w:pPr>
+      <w:r>
+        <w:rPr>
+          <w:b/>
+          <w:bCs/>
+          <w:color w:val="D47E10"/>
+        </w:rPr>
+        <w:t xml:space="preserve">Follow-up: </w:t>
+      </w:r>
+      <w:r>
+        <w:t xml:space="preserve">Is every read path like this?</w:t>
+      </w:r>
+    </w:p>
+    <w:p>
+      <w:pPr>
+        <w:shd w:val="clear" w:color="auto" w:fill="EEF2FF"/>
+        <w:ind w:left="80"/>
+      </w:pPr>
+      <w:r>
+        <w:rPr>
+          <w:b/>
+          <w:bCs/>
+          <w:color w:val="4F5BD5"/>
+        </w:rPr>
+        <w:t xml:space="preserve">Remember: </w:t>
+      </w:r>
+      <w:r>
+        <w:t xml:space="preserve">Yes - products, stock batches (b.product.ownerId), purchases, reports, invoices; TenantIsolationTest pins each one.</w:t>
+      </w:r>
+    </w:p>
+    <w:p>
+      <w:pPr>
+        <w:keepNext/>
+        <w:pBdr>
+          <w:left w:val="single" w:sz="14" w:space="6" w:color="0F886D"/>
+        </w:pBdr>
+        <w:shd w:val="clear" w:color="auto" w:fill="F8FAFC"/>
+        <w:spacing w:before="200" w:after="70"/>
+        <w:ind w:left="80"/>
+      </w:pPr>
+      <w:r>
+        <w:rPr>
+          <w:b/>
+          <w:bCs/>
+          <w:color w:val="0F886D"/>
+        </w:rPr>
+        <w:t xml:space="preserve">Q136. </w:t>
+      </w:r>
+      <w:r>
+        <w:rPr>
+          <w:b/>
+          <w:bCs/>
+          <w:color w:val="0A1424"/>
+        </w:rPr>
+        <w:t xml:space="preserve">How does registration work once the app is multi-tenant?</w:t>
+      </w:r>
+    </w:p>
+    <w:p>
+      <w:pPr>
+        <w:spacing w:after="50" w:line="264" w:lineRule="auto"/>
+        <w:ind w:left="80"/>
+      </w:pPr>
+      <w:r>
+        <w:rPr>
+          <w:b/>
+          <w:bCs/>
+          <w:color w:val="0F886D"/>
+        </w:rPr>
+        <w:t xml:space="preserve">Answer: </w:t>
+      </w:r>
+      <w:r>
+        <w:t xml:space="preserve">Three modes in </w:t>
+      </w:r>
+      <w:r>
+        <w:rPr>
+          <w:rFonts w:ascii="Consolas" w:eastAsia="Consolas" w:hAnsi="Consolas" w:cs="Consolas"/>
+          <w:color w:val="B03A2E"/>
+          <w:sz w:val="20"/>
+          <w:szCs w:val="20"/>
+        </w:rPr>
+        <w:t xml:space="preserve">AuthService.register()</w:t>
+      </w:r>
+      <w:r>
+        <w:t xml:space="preserve">: anonymous -&gt; role forced to OWNER, owner_id null (starts a new shop; asking for STAFF is 403 "Register as an owner to start a new shop"); OWNER token -&gt; may only create STAFF with owner_id set to the caller's shop (asking for OWNER is 403 "An owner can only add staff users"); STAFF token -&gt; 403 always. Duplicate email is 409. The old first-user-bootstrap rule is gone: anyone can open their own shop, nobody can write into someone else's.</w:t>
+      </w:r>
+    </w:p>
+    <w:p>
+      <w:pPr>
+        <w:spacing w:after="50" w:line="264" w:lineRule="auto"/>
+        <w:ind w:left="80"/>
+      </w:pPr>
+      <w:r>
+        <w:rPr>
+          <w:b/>
+          <w:bCs/>
+          <w:color w:val="D47E10"/>
+        </w:rPr>
+        <w:t xml:space="preserve">Follow-up: </w:t>
+      </w:r>
+      <w:r>
+        <w:t xml:space="preserve">So an owner token can never create a second owner?</w:t>
+      </w:r>
+    </w:p>
+    <w:p>
+      <w:pPr>
+        <w:shd w:val="clear" w:color="auto" w:fill="EEF2FF"/>
+        <w:ind w:left="80"/>
+      </w:pPr>
+      <w:r>
+        <w:rPr>
+          <w:b/>
+          <w:bCs/>
+          <w:color w:val="4F5BD5"/>
+        </w:rPr>
+        <w:t xml:space="preserve">Remember: </w:t>
+      </w:r>
+      <w:r>
+        <w:t xml:space="preserve">Never - a second owner only exists as an anonymous sign-up that starts their OWN shop.</w:t>
+      </w:r>
+    </w:p>
+    <w:p>
+      <w:pPr>
+        <w:keepNext/>
+        <w:pBdr>
+          <w:left w:val="single" w:sz="14" w:space="6" w:color="0F886D"/>
+        </w:pBdr>
+        <w:shd w:val="clear" w:color="auto" w:fill="F8FAFC"/>
+        <w:spacing w:before="200" w:after="70"/>
+        <w:ind w:left="80"/>
+      </w:pPr>
+      <w:r>
+        <w:rPr>
+          <w:b/>
+          <w:bCs/>
+          <w:color w:val="0F886D"/>
+        </w:rPr>
+        <w:t xml:space="preserve">Q137. </w:t>
+      </w:r>
+      <w:r>
+        <w:rPr>
+          <w:b/>
+          <w:bCs/>
+          <w:color w:val="0A1424"/>
+        </w:rPr>
+        <w:t xml:space="preserve">Which columns are unique now that data is shared?</w:t>
+      </w:r>
+    </w:p>
+    <w:p>
+      <w:pPr>
+        <w:spacing w:after="50" w:line="264" w:lineRule="auto"/>
+        <w:ind w:left="80"/>
+      </w:pPr>
+      <w:r>
+        <w:rPr>
+          <w:b/>
+          <w:bCs/>
+          <w:color w:val="0F886D"/>
+        </w:rPr>
+        <w:t xml:space="preserve">Answer: </w:t>
+      </w:r>
+      <w:r>
+        <w:rPr>
+          <w:rFonts w:ascii="Consolas" w:eastAsia="Consolas" w:hAnsi="Consolas" w:cs="Consolas"/>
+          <w:color w:val="B03A2E"/>
+          <w:sz w:val="20"/>
+          <w:szCs w:val="20"/>
+        </w:rPr>
+        <w:t xml:space="preserve">users.email</w:t>
+      </w:r>
+      <w:r>
+        <w:t xml:space="preserve"> stays globally unique - login is by email. Everything shop-scoped became per-shop: category.name via </w:t>
+      </w:r>
+      <w:r>
+        <w:rPr>
+          <w:rFonts w:ascii="Consolas" w:eastAsia="Consolas" w:hAnsi="Consolas" w:cs="Consolas"/>
+          <w:color w:val="B03A2E"/>
+          <w:sz w:val="20"/>
+          <w:szCs w:val="20"/>
+        </w:rPr>
+        <w:t xml:space="preserve">existsByOwnerIdAndName</w:t>
+      </w:r>
+      <w:r>
+        <w:t xml:space="preserve">, barcode via </w:t>
+      </w:r>
+      <w:r>
+        <w:rPr>
+          <w:rFonts w:ascii="Consolas" w:eastAsia="Consolas" w:hAnsi="Consolas" w:cs="Consolas"/>
+          <w:color w:val="B03A2E"/>
+          <w:sz w:val="20"/>
+          <w:szCs w:val="20"/>
+        </w:rPr>
+        <w:t xml:space="preserve">existsByOwnerIdAndBarcode</w:t>
+      </w:r>
+      <w:r>
+        <w:t xml:space="preserve">, and invoice numbers are per-tenant - </w:t>
+      </w:r>
+      <w:r>
+        <w:rPr>
+          <w:rFonts w:ascii="Consolas" w:eastAsia="Consolas" w:hAnsi="Consolas" w:cs="Consolas"/>
+          <w:color w:val="B03A2E"/>
+          <w:sz w:val="20"/>
+          <w:szCs w:val="20"/>
+        </w:rPr>
+        <w:t xml:space="preserve">nextInvoiceNumber(ownerId)</w:t>
+      </w:r>
+      <w:r>
+        <w:t xml:space="preserve"> reads only that shop's last invoice, so INV-2026-0001 exists once per shop, not once globally.</w:t>
+      </w:r>
+    </w:p>
+    <w:p>
+      <w:pPr>
+        <w:spacing w:after="50" w:line="264" w:lineRule="auto"/>
+        <w:ind w:left="80"/>
+      </w:pPr>
+      <w:r>
+        <w:rPr>
+          <w:b/>
+          <w:bCs/>
+          <w:color w:val="D47E10"/>
+        </w:rPr>
+        <w:t xml:space="preserve">Follow-up: </w:t>
+      </w:r>
+      <w:r>
+        <w:t xml:space="preserve">Why not composite unique indexes on (owner_id, name)?</w:t>
+      </w:r>
+    </w:p>
+    <w:p>
+      <w:pPr>
+        <w:shd w:val="clear" w:color="auto" w:fill="EEF2FF"/>
+        <w:ind w:left="80"/>
+      </w:pPr>
+      <w:r>
+        <w:rPr>
+          <w:b/>
+          <w:bCs/>
+          <w:color w:val="4F5BD5"/>
+        </w:rPr>
+        <w:t xml:space="preserve">Remember: </w:t>
+      </w:r>
+      <w:r>
+        <w:t xml:space="preserve">Service checks give friendly 409s today; composite unique constraints are the production hardening - name it before they do.</w:t>
+      </w:r>
+    </w:p>
+    <w:p>
+      <w:pPr>
+        <w:keepNext/>
+        <w:pBdr>
+          <w:left w:val="single" w:sz="14" w:space="6" w:color="0F886D"/>
+        </w:pBdr>
+        <w:shd w:val="clear" w:color="auto" w:fill="F8FAFC"/>
+        <w:spacing w:before="200" w:after="70"/>
+        <w:ind w:left="80"/>
+      </w:pPr>
+      <w:r>
+        <w:rPr>
+          <w:b/>
+          <w:bCs/>
+          <w:color w:val="0F886D"/>
+        </w:rPr>
+        <w:t xml:space="preserve">Q138. </w:t>
+      </w:r>
+      <w:r>
+        <w:rPr>
+          <w:b/>
+          <w:bCs/>
+          <w:color w:val="0A1424"/>
+        </w:rPr>
+        <w:t xml:space="preserve">How did you test the isolation?</w:t>
+      </w:r>
+    </w:p>
+    <w:p>
+      <w:pPr>
+        <w:spacing w:after="50" w:line="264" w:lineRule="auto"/>
+        <w:ind w:left="80"/>
+      </w:pPr>
+      <w:r>
+        <w:rPr>
+          <w:b/>
+          <w:bCs/>
+          <w:color w:val="0F886D"/>
+        </w:rPr>
+        <w:t xml:space="preserve">Answer: </w:t>
+      </w:r>
+      <w:r>
+        <w:rPr>
+          <w:rFonts w:ascii="Consolas" w:eastAsia="Consolas" w:hAnsi="Consolas" w:cs="Consolas"/>
+          <w:color w:val="B03A2E"/>
+          <w:sz w:val="20"/>
+          <w:szCs w:val="20"/>
+        </w:rPr>
+        <w:t xml:space="preserve">TenantIsolationTest</w:t>
+      </w:r>
+      <w:r>
+        <w:t xml:space="preserve"> - six MockMvc tests with two owners: a fresh owner starts empty while the seeded owner keeps their data; owner B gets 404 on owner A's invoice; billing against another shop's product is 404; the same category name is legal in two shops but rejected twice in one; staff created by an owner see only that owner's shop; reports return only the caller's numbers. The smoke script adds the register rules - 62 checks in total.</w:t>
+      </w:r>
+    </w:p>
+    <w:p>
+      <w:pPr>
+        <w:spacing w:after="50" w:line="264" w:lineRule="auto"/>
+        <w:ind w:left="80"/>
+      </w:pPr>
+      <w:r>
+        <w:rPr>
+          <w:b/>
+          <w:bCs/>
+          <w:color w:val="D47E10"/>
+        </w:rPr>
+        <w:t xml:space="preserve">Follow-up: </w:t>
+      </w:r>
+      <w:r>
+        <w:t xml:space="preserve">You retrofitted tenancy - what was the hard part?</w:t>
+      </w:r>
+    </w:p>
+    <w:p>
+      <w:pPr>
+        <w:shd w:val="clear" w:color="auto" w:fill="EEF2FF"/>
+        <w:ind w:left="80"/>
+      </w:pPr>
+      <w:r>
+        <w:rPr>
+          <w:b/>
+          <w:bCs/>
+          <w:color w:val="4F5BD5"/>
+        </w:rPr>
+        <w:t xml:space="preserve">Remember: </w:t>
+      </w:r>
+      <w:r>
+        <w:t xml:space="preserve">Every repository method grew an owner_id parameter; CurrentTenant on the principal is the seam that left controllers untouched.</w:t>
+      </w:r>
+    </w:p>
+    <w:p>
+      <w:pPr>
+        <w:keepNext/>
+        <w:pBdr>
+          <w:left w:val="single" w:sz="14" w:space="6" w:color="0F886D"/>
+        </w:pBdr>
+        <w:shd w:val="clear" w:color="auto" w:fill="F8FAFC"/>
+        <w:spacing w:before="200" w:after="70"/>
+        <w:ind w:left="80"/>
+      </w:pPr>
+      <w:r>
+        <w:rPr>
+          <w:b/>
+          <w:bCs/>
+          <w:color w:val="0F886D"/>
+        </w:rPr>
+        <w:t xml:space="preserve">Q139. </w:t>
+      </w:r>
+      <w:r>
+        <w:rPr>
+          <w:b/>
+          <w:bCs/>
+          <w:color w:val="0A1424"/>
+        </w:rPr>
+        <w:t xml:space="preserve">What was the hardest part of adding multi-tenancy?</w:t>
+      </w:r>
+    </w:p>
+    <w:p>
+      <w:pPr>
+        <w:spacing w:after="50" w:line="264" w:lineRule="auto"/>
+        <w:ind w:left="80"/>
+      </w:pPr>
+      <w:r>
+        <w:rPr>
+          <w:b/>
+          <w:bCs/>
+          <w:color w:val="0F886D"/>
+        </w:rPr>
+        <w:t xml:space="preserve">Answer: </w:t>
+      </w:r>
+      <w:r>
+        <w:t xml:space="preserve">Finding every implicit assumption that ids are global. A single unscoped </w:t>
+      </w:r>
+      <w:r>
+        <w:rPr>
+          <w:rFonts w:ascii="Consolas" w:eastAsia="Consolas" w:hAnsi="Consolas" w:cs="Consolas"/>
+          <w:color w:val="B03A2E"/>
+          <w:sz w:val="20"/>
+          <w:szCs w:val="20"/>
+        </w:rPr>
+        <w:t xml:space="preserve">findById(id)</w:t>
+      </w:r>
+      <w:r>
+        <w:t xml:space="preserve"> anywhere would have leaked across shops, so I changed signatures instead of adding if-checks: repository methods take the tenant as a required parameter, which means a new query cannot be written without deciding whose rows it reads. The suite failed loudly until every path was scoped.</w:t>
+      </w:r>
+    </w:p>
+    <w:p>
+      <w:pPr>
+        <w:spacing w:after="50" w:line="264" w:lineRule="auto"/>
+        <w:ind w:left="80"/>
+      </w:pPr>
+      <w:r>
+        <w:rPr>
+          <w:b/>
+          <w:bCs/>
+          <w:color w:val="D47E10"/>
+        </w:rPr>
+        <w:t xml:space="preserve">Follow-up: </w:t>
+      </w:r>
+      <w:r>
+        <w:t xml:space="preserve">How do you keep it from regressing?</w:t>
+      </w:r>
+    </w:p>
+    <w:p>
+      <w:pPr>
+        <w:shd w:val="clear" w:color="auto" w:fill="EEF2FF"/>
+        <w:ind w:left="80"/>
+      </w:pPr>
+      <w:r>
+        <w:rPr>
+          <w:b/>
+          <w:bCs/>
+          <w:color w:val="4F5BD5"/>
+        </w:rPr>
+        <w:t xml:space="preserve">Remember: </w:t>
+      </w:r>
+      <w:r>
+        <w:t xml:space="preserve">Review invariant: a repository call without owner_id does not merge - grep proves it, the test suite enforces it.</w:t>
+      </w:r>
+    </w:p>
+    <w:p>
+      <w:pPr>
+        <w:keepNext/>
+        <w:pBdr>
+          <w:left w:val="single" w:sz="14" w:space="6" w:color="0F886D"/>
+        </w:pBdr>
+        <w:shd w:val="clear" w:color="auto" w:fill="F8FAFC"/>
+        <w:spacing w:before="200" w:after="70"/>
+        <w:ind w:left="80"/>
+      </w:pPr>
+      <w:r>
+        <w:rPr>
+          <w:b/>
+          <w:bCs/>
+          <w:color w:val="0F886D"/>
+        </w:rPr>
+        <w:t xml:space="preserve">Q140. </w:t>
+      </w:r>
+      <w:r>
+        <w:rPr>
+          <w:b/>
+          <w:bCs/>
+          <w:color w:val="0A1424"/>
+        </w:rPr>
+        <w:t xml:space="preserve">Where would you go next with tenancy?</w:t>
+      </w:r>
+    </w:p>
+    <w:p>
+      <w:pPr>
+        <w:spacing w:after="50" w:line="264" w:lineRule="auto"/>
+        <w:ind w:left="80"/>
+      </w:pPr>
+      <w:r>
+        <w:rPr>
+          <w:b/>
+          <w:bCs/>
+          <w:color w:val="0F886D"/>
+        </w:rPr>
+        <w:t xml:space="preserve">Answer: </w:t>
+      </w:r>
+      <w:r>
+        <w:t xml:space="preserve">Three steps: composite indexes on (owner_id, ...) so tenant scans stay fast as rows grow; DB unique constraints on (owner_id, name) backing the service checks; and created_by columns so staff actions inside a shop are attributable. If one database becomes the limit, sharding by owner_id is a data move - the column and every query already exist.</w:t>
+      </w:r>
+    </w:p>
+    <w:p>
+      <w:pPr>
+        <w:spacing w:after="50" w:line="264" w:lineRule="auto"/>
+        <w:ind w:left="80"/>
+      </w:pPr>
+      <w:r>
+        <w:rPr>
+          <w:b/>
+          <w:bCs/>
+          <w:color w:val="D47E10"/>
+        </w:rPr>
+        <w:t xml:space="preserve">Follow-up: </w:t>
+      </w:r>
+      <w:r>
+        <w:t xml:space="preserve">Schema-per-tenant instead?</w:t>
+      </w:r>
+    </w:p>
+    <w:p>
+      <w:pPr>
+        <w:shd w:val="clear" w:color="auto" w:fill="EEF2FF"/>
+        <w:ind w:left="80"/>
+      </w:pPr>
+      <w:r>
+        <w:rPr>
+          <w:b/>
+          <w:bCs/>
+          <w:color w:val="4F5BD5"/>
+        </w:rPr>
+        <w:t xml:space="preserve">Remember: </w:t>
+      </w:r>
+      <w:r>
+        <w:t xml:space="preserve">Only for noisy neighbours - it costs migrations and connections; at shop scale row-level tenancy is the right trade.</w:t>
+      </w:r>
+    </w:p>
+    <w:p>
+      <w:pPr>
         <w:pStyle w:val="Heading1"/>
       </w:pPr>
       <w:bookmarkStart w:id="65" w:name="_Toc242064880"/>
@@ -31691,7 +32666,7 @@
         <w:t>JwtAuthFilter</w:t>
       </w:r>
       <w:r>
-        <w:t>; roles OWNER/STAFF.</w:t>
+        <w:t>; roles OWNER/STAFF; every query scoped by owner_id.</w:t>
       </w:r>
     </w:p>
     <w:p>
@@ -31757,7 +32732,7 @@
           <w:b/>
           <w:bCs/>
         </w:rPr>
-        <w:t>25 tests (MockMvc)</w:t>
+        <w:t>34 tests in 9 classes</w:t>
       </w:r>
       <w:r>
         <w:t xml:space="preserve"> + </w:t>
@@ -31767,7 +32742,7 @@
           <w:b/>
           <w:bCs/>
         </w:rPr>
-        <w:t>59-check smoke script</w:t>
+        <w:t>62-check smoke script</w:t>
       </w:r>
       <w:r>
         <w:t xml:space="preserve">; </w:t>
@@ -31856,7 +32831,7 @@
         <w:t>JwtAuthFilter</w:t>
       </w:r>
       <w:r>
-        <w:t xml:space="preserve"> fills SecurityContext -&gt; URL rules: STAFF gets GET products/categories/stock + GET/POST invoices; everything else OWNER.</w:t>
+        <w:t xml:space="preserve"> fills SecurityContext -&gt; URL rules: STAFF gets GET products/categories/stock + GET/POST invoices; everything else OWNER; every query carries the caller's owner_id.</w:t>
       </w:r>
     </w:p>
     <w:p>
@@ -32005,7 +32980,7 @@
           <w:sz w:val="18"/>
           <w:szCs w:val="18"/>
         </w:rPr>
-        <w:t>Entities: 9    Endpoints: ~31    Test classes: 8    Tests: 25    Smoke checks: 59</w:t>
+        <w:t>Entities: 9    Endpoints: ~28    Test classes: 9    Tests: 34    Smoke checks: 62</w:t>
       </w:r>
     </w:p>
     <w:p>
@@ -32074,7 +33049,7 @@
       </w:pPr>
       <w:bookmarkStart w:id="69" w:name="_Toc242064884"/>
       <w:r>
-        <w:t>Top 15 questions to rehearse</w:t>
+        <w:t>Top 16 questions to rehearse</w:t>
       </w:r>
       <w:bookmarkEnd w:id="69"/>
     </w:p>
@@ -32335,16 +33310,6 @@
     </w:p>
     <w:p>
       <w:pPr>
-        <w:pStyle w:val="Heading2"/>
-      </w:pPr>
-      <w:bookmarkStart w:id="70" w:name="_Toc242064885"/>
-      <w:r>
-        <w:t>Top 10 things never to say</w:t>
-      </w:r>
-      <w:bookmarkEnd w:id="70"/>
-    </w:p>
-    <w:p>
-      <w:pPr>
         <w:pStyle w:val="ListParagraph"/>
         <w:numPr>
           <w:ilvl w:val="0"/>
@@ -32353,8 +33318,18 @@
         <w:spacing w:after="50" w:line="264" w:lineRule="auto"/>
       </w:pPr>
       <w:r>
-        <w:t>1. "I copied it from a tutorial." (own the decisions.)</w:t>
-      </w:r>
+        <w:t xml:space="preserve">16. How do you keep one shop's data out of another shop's hands? (owner_id in every query; cross-tenant ids return 404.)</w:t>
+      </w:r>
+    </w:p>
+    <w:p>
+      <w:pPr>
+        <w:pStyle w:val="Heading2"/>
+      </w:pPr>
+      <w:bookmarkStart w:id="70" w:name="_Toc242064885"/>
+      <w:r>
+        <w:t>Top 10 things never to say</w:t>
+      </w:r>
+      <w:bookmarkEnd w:id="70"/>
     </w:p>
     <w:p>
       <w:pPr>
@@ -32366,7 +33341,7 @@
         <w:spacing w:after="50" w:line="264" w:lineRule="auto"/>
       </w:pPr>
       <w:r>
-        <w:t>2. "Redux/Kafka/Redis is used here." (they are not - the stack table is real.)</w:t>
+        <w:t>1. "I copied it from a tutorial." (own the decisions.)</w:t>
       </w:r>
     </w:p>
     <w:p>
@@ -32379,7 +33354,7 @@
         <w:spacing w:after="50" w:line="264" w:lineRule="auto"/>
       </w:pPr>
       <w:r>
-        <w:t>3. "The database is fully indexed." (no index DDL exists - say what you WOULD index.)</w:t>
+        <w:t>2. "Redux/Kafka/Redis is used here." (they are not - the stack table is real.)</w:t>
       </w:r>
     </w:p>
     <w:p>
@@ -32392,7 +33367,7 @@
         <w:spacing w:after="50" w:line="264" w:lineRule="auto"/>
       </w:pPr>
       <w:r>
-        <w:t>4. "JWT is 100% secure / tokens cannot be stolen." (acknowledge XSS risk of localStorage.)</w:t>
+        <w:t>3. "The database is fully indexed." (no index DDL exists - say what you WOULD index.)</w:t>
       </w:r>
     </w:p>
     <w:p>
@@ -32405,7 +33380,7 @@
         <w:spacing w:after="50" w:line="264" w:lineRule="auto"/>
       </w:pPr>
       <w:r>
-        <w:t>5. "My code has no bugs." (name the CSS modal bug or the smoke-script issue instead.)</w:t>
+        <w:t>4. "JWT is 100% secure / tokens cannot be stolen." (acknowledge XSS risk of localStorage.)</w:t>
       </w:r>
     </w:p>
     <w:p>
@@ -32418,7 +33393,7 @@
         <w:spacing w:after="50" w:line="264" w:lineRule="auto"/>
       </w:pPr>
       <w:r>
-        <w:t>6. "I worked in a big team of 10." (it is solo - own it: "I owned everything, which taught me ...").</w:t>
+        <w:t>5. "My code has no bugs." (name the CSS modal bug or the smoke-script issue instead.)</w:t>
       </w:r>
     </w:p>
     <w:p>
@@ -32431,7 +33406,7 @@
         <w:spacing w:after="50" w:line="264" w:lineRule="auto"/>
       </w:pPr>
       <w:r>
-        <w:t>7. "Spring Security handles everything so authorization is automatic." (I wrote the URL rules.)</w:t>
+        <w:t>6. "I worked in a big team of 10." (it is solo - own it: "I owned everything, which taught me ...").</w:t>
       </w:r>
     </w:p>
     <w:p>
@@ -32444,7 +33419,7 @@
         <w:spacing w:after="50" w:line="264" w:lineRule="auto"/>
       </w:pPr>
       <w:r>
-        <w:t>8. "H2 is production-ready." (it is the dev default; MySQL is the production path.)</w:t>
+        <w:t>7. "Spring Security handles everything so authorization is automatic." (I wrote the URL rules.)</w:t>
       </w:r>
     </w:p>
     <w:p>
@@ -32457,7 +33432,7 @@
         <w:spacing w:after="50" w:line="264" w:lineRule="auto"/>
       </w:pPr>
       <w:r>
-        <w:t>9. "I don't know" with nothing after it. (Use: "I have not used it; my understanding is X, and I would verify by Y.")</w:t>
+        <w:t>8. "H2 is production-ready." (it is the dev default; MySQL is the production path.)</w:t>
       </w:r>
     </w:p>
     <w:p>
@@ -32470,7 +33445,20 @@
         <w:spacing w:after="50" w:line="264" w:lineRule="auto"/>
       </w:pPr>
       <w:r>
-        <w:t>10. Long silent pauses on numbers - rehearse: 25 tests, 59 checks, 20 products, 9 entities, 24 h token.</w:t>
+        <w:t>9. "I don't know" with nothing after it. (Use: "I have not used it; my understanding is X, and I would verify by Y.")</w:t>
+      </w:r>
+    </w:p>
+    <w:p>
+      <w:pPr>
+        <w:pStyle w:val="ListParagraph"/>
+        <w:numPr>
+          <w:ilvl w:val="0"/>
+          <w:numId w:val="2"/>
+        </w:numPr>
+        <w:spacing w:after="50" w:line="264" w:lineRule="auto"/>
+      </w:pPr>
+      <w:r>
+        <w:t>10. Long silent pauses on numbers - rehearse: 34 tests, 62 checks, 20 products, 9 entities, 24 h token.</w:t>
       </w:r>
     </w:p>
     <w:p>

</xml_diff>